<commit_message>
fix(net): apply dashboard network settings via NetworkManager, not dhcpcd
The devices run NetworkManager; dhcpcd is inactive and nothing read the
/etc/dhcpcd.conf the dashboard wrote, so the static-IP feature was dead code.
ipr_net_apply.sh (root helper, sudoers) now modifies the home profile with
nmcli and re-activates it, so a change takes effect at once. Saving the
Settings page applies directly; the apply-network action re-applies the
stored values. Verified on ipr-prod-zero2 (DHCP re-apply keeps the address).

tests/conftest.py: fixture LogPort 443, matching config.default.json.
Admin manual 1.8.2.

Co-Authored-By: Claude Opus 5 (1M context) <noreply@anthropic.com>
Claude-Session: https://claude.ai/code/session_01GX15fqsPoufJXa3hdJmFWm
</commit_message>
<xml_diff>
--- a/docs/manuals/Administratormanual_IPR_Pen_Bridge.docx
+++ b/docs/manuals/Administratormanual_IPR_Pen_Bridge.docx
@@ -101,7 +101,7 @@
                 <w:rFonts w:ascii="Segoe UI" w:hAnsi="Segoe UI"/>
                 <w:sz w:val="20"/>
               </w:rPr>
-              <w:t>1.8.1</w:t>
+              <w:t>1.8.2</w:t>
             </w:r>
           </w:p>
         </w:tc>
@@ -10978,7 +10978,7 @@
           <w:rFonts w:ascii="Segoe UI" w:hAnsi="Segoe UI"/>
           <w:sz w:val="21"/>
         </w:rPr>
-        <w:t>webport, DHCP eller statisk adressering med IP, netmaske og gateway.</w:t>
+        <w:t>webport, DHCP eller statisk adressering med IP, netmaske og gateway. Anvendes med det samme på hjemmenettets NetworkManager-profil via hjælperen ipr_net_apply.sh (sudoers); skifter adressen, skal browseren genforbinde på den nye. Kan også sættes fra kommandolinjen: sudo ipr_net_apply.sh dhcp | static &lt;ip&gt; &lt;netmaske&gt; [gateway] | show.</w:t>
       </w:r>
     </w:p>
     <w:p>
@@ -19305,7 +19305,7 @@
                 <w:rFonts w:ascii="Segoe UI" w:hAnsi="Segoe UI"/>
                 <w:sz w:val="19"/>
               </w:rPr>
-              <w:t>Tænd hotspottet med magneten, og ret indstillingerne via https://10.42.0.1/setup/.</w:t>
+              <w:t>Tænd hotspottet med magneten, og ret indstillingerne via https://10.42.0.1/login (Indstillinger), eller over SSH på hotspottet i udviklingstilstand: sudo ipr_net_apply.sh dhcp.</w:t>
             </w:r>
           </w:p>
         </w:tc>
@@ -23177,7 +23177,7 @@
         <w:color w:val="606C80"/>
         <w:sz w:val="16"/>
       </w:rPr>
-      <w:t xml:space="preserve">IPR-DOC-002 · Administratormanual · version 1.8.1   ·   Side </w:t>
+      <w:t xml:space="preserve">IPR-DOC-002 · Administratormanual · version 1.8.2   ·   Side </w:t>
     </w:r>
     <w:r>
       <w:rPr>

</xml_diff>

<commit_message>
feat(led): controlled shutdown with the magnet; hold ladder 3/6/10/15/20 s
The device is powered from a PC's USB port, and pulling the plug mid-write
risks the SD card. Holding the magnet 6 s (cyan blink) now runs a clean
poweroff via ipr_hotspot_ctl.sh; the LED stays cyan while the OS stops and
ipr-led-halt.service (ExecStop late in the shutdown) turns it off - dark LED
means safe to unplug. The app leaves the pins lit when stopped for a
shutdown, and SIGTERM is routed through the same stop path.

Shutdown is the everyday gesture, so it takes the 6 s slot; mode toggle moves
to 10 s and the Wi-Fi reset to 15 s, and holding past 20 s (LED off) cancels
- there was no way to abort once the red step was reached. Manuals (user 1.5,
admin 1.9.0 with a new 4.6), figures and docs updated; test_provision K.11.

Co-Authored-By: Claude Opus 5 (1M context) <noreply@anthropic.com>
Claude-Session: https://claude.ai/code/session_01GX15fqsPoufJXa3hdJmFWm
</commit_message>
<xml_diff>
--- a/docs/manuals/Administratormanual_IPR_Pen_Bridge.docx
+++ b/docs/manuals/Administratormanual_IPR_Pen_Bridge.docx
@@ -101,7 +101,7 @@
                 <w:rFonts w:ascii="Segoe UI" w:hAnsi="Segoe UI"/>
                 <w:sz w:val="20"/>
               </w:rPr>
-              <w:t>1.8.2</w:t>
+              <w:t>1.9.0</w:t>
             </w:r>
           </w:p>
         </w:tc>
@@ -1748,7 +1748,7 @@
                 <w:rFonts w:ascii="Consolas" w:hAnsi="Consolas"/>
                 <w:sz w:val="18"/>
               </w:rPr>
-              <w:t>irispen-mount.service</w:t>
+              <w:t>ipr-led-halt.service</w:t>
             </w:r>
           </w:p>
         </w:tc>
@@ -1765,7 +1765,7 @@
                 <w:rFonts w:ascii="Segoe UI" w:hAnsi="Segoe UI"/>
                 <w:sz w:val="19"/>
               </w:rPr>
-              <w:t>Monterer IRIS-skanneren (MTP, jmtpfs) på /mnt/irispen, når udev ser den; stoppes og afmonteres, når den trækkes ud (BindsTo=).</w:t>
+              <w:t>ExecStop sent i nedlukningen: slukker statuslampen = strømmen må tages fra (afsnit 4.6).</w:t>
             </w:r>
           </w:p>
         </w:tc>
@@ -1782,7 +1782,7 @@
                 <w:rFonts w:ascii="Segoe UI" w:hAnsi="Segoe UI"/>
                 <w:sz w:val="19"/>
               </w:rPr>
-              <w:t>applikationsbruger</w:t>
+              <w:t>root</w:t>
             </w:r>
           </w:p>
         </w:tc>
@@ -1802,7 +1802,7 @@
                 <w:rFonts w:ascii="Consolas" w:hAnsi="Consolas"/>
                 <w:sz w:val="18"/>
               </w:rPr>
-              <w:t>ipr-failure@.service</w:t>
+              <w:t>irispen-mount.service</w:t>
             </w:r>
           </w:p>
         </w:tc>
@@ -1820,7 +1820,7 @@
                 <w:rFonts w:ascii="Segoe UI" w:hAnsi="Segoe UI"/>
                 <w:sz w:val="19"/>
               </w:rPr>
-              <w:t>OnFailure-handler: skriver én linje pr. fejlet kerneenhed til /var/lib/ipr-keyboard/incidents.log (afsnit 9.5).</w:t>
+              <w:t>Monterer IRIS-skanneren (MTP, jmtpfs) på /mnt/irispen, når udev ser den; stoppes og afmonteres, når den trækkes ud (BindsTo=).</w:t>
             </w:r>
           </w:p>
         </w:tc>
@@ -1838,7 +1838,7 @@
                 <w:rFonts w:ascii="Segoe UI" w:hAnsi="Segoe UI"/>
                 <w:sz w:val="19"/>
               </w:rPr>
-              <w:t>root</w:t>
+              <w:t>applikationsbruger</w:t>
             </w:r>
           </w:p>
         </w:tc>
@@ -1857,6 +1857,60 @@
                 <w:rFonts w:ascii="Consolas" w:hAnsi="Consolas"/>
                 <w:sz w:val="18"/>
               </w:rPr>
+              <w:t>ipr-failure@.service</w:t>
+            </w:r>
+          </w:p>
+        </w:tc>
+        <w:tc>
+          <w:tcPr>
+            <w:tcW w:type="dxa" w:w="4876"/>
+          </w:tcPr>
+          <w:p>
+            <w:pPr>
+              <w:spacing w:after="40"/>
+            </w:pPr>
+            <w:r>
+              <w:rPr>
+                <w:rFonts w:ascii="Segoe UI" w:hAnsi="Segoe UI"/>
+                <w:sz w:val="19"/>
+              </w:rPr>
+              <w:t>OnFailure-handler: skriver én linje pr. fejlet kerneenhed til /var/lib/ipr-keyboard/incidents.log (afsnit 9.5).</w:t>
+            </w:r>
+          </w:p>
+        </w:tc>
+        <w:tc>
+          <w:tcPr>
+            <w:tcW w:type="dxa" w:w="1361"/>
+          </w:tcPr>
+          <w:p>
+            <w:pPr>
+              <w:spacing w:after="40"/>
+            </w:pPr>
+            <w:r>
+              <w:rPr>
+                <w:rFonts w:ascii="Segoe UI" w:hAnsi="Segoe UI"/>
+                <w:sz w:val="19"/>
+              </w:rPr>
+              <w:t>root</w:t>
+            </w:r>
+          </w:p>
+        </w:tc>
+      </w:tr>
+      <w:tr>
+        <w:tc>
+          <w:tcPr>
+            <w:tcW w:type="dxa" w:w="2608"/>
+            <w:shd w:val="clear" w:color="auto" w:fill="F7FAFC"/>
+          </w:tcPr>
+          <w:p>
+            <w:pPr>
+              <w:spacing w:after="40"/>
+            </w:pPr>
+            <w:r>
+              <w:rPr>
+                <w:rFonts w:ascii="Consolas" w:hAnsi="Consolas"/>
+                <w:sz w:val="18"/>
+              </w:rPr>
               <w:t>ipr-cert-renew.timer</w:t>
             </w:r>
           </w:p>
@@ -1864,6 +1918,7 @@
         <w:tc>
           <w:tcPr>
             <w:tcW w:type="dxa" w:w="4876"/>
+            <w:shd w:val="clear" w:color="auto" w:fill="F7FAFC"/>
           </w:tcPr>
           <w:p>
             <w:pPr>
@@ -1881,6 +1936,7 @@
         <w:tc>
           <w:tcPr>
             <w:tcW w:type="dxa" w:w="1361"/>
+            <w:shd w:val="clear" w:color="auto" w:fill="F7FAFC"/>
           </w:tcPr>
           <w:p>
             <w:pPr>
@@ -2441,7 +2497,7 @@
                 <w:rFonts w:ascii="Segoe UI" w:hAnsi="Segoe UI"/>
                 <w:sz w:val="19"/>
               </w:rPr>
-              <w:t>Skifter drift/udvikling; magneten (6 s) bruger den via sudoers.</w:t>
+              <w:t>Skifter drift/udvikling; magneten (10 s) bruger den via sudoers.</w:t>
             </w:r>
           </w:p>
         </w:tc>
@@ -12672,6 +12728,442 @@
       </w:r>
     </w:p>
     <w:p>
+      <w:pPr>
+        <w:pStyle w:val="Heading2"/>
+      </w:pPr>
+      <w:r>
+        <w:t>4.6 Kontrolleret nedlukning med magneten</w:t>
+      </w:r>
+    </w:p>
+    <w:p>
+      <w:r>
+        <w:rPr>
+          <w:rFonts w:ascii="Segoe UI" w:hAnsi="Segoe UI"/>
+          <w:b w:val="0"/>
+          <w:i w:val="0"/>
+          <w:sz w:val="21"/>
+        </w:rPr>
+        <w:t>Enheden forsynes typisk fra PC'ens USB-port, og et SD-kort, der mister strømmen under en skrivning, kan blive ødelagt. Magneten giver en kontrolleret nedlukning: hold i 6 sekunder (lampen blinker turkis) og slip. gpio_monitor kalder ipr_hotspot_ctl.sh poweroff (systemctl poweroff) og viser konstant turkis; når systemd stopper ipr_keyboard.service, efterlades benene bevidst på turkis, og ipr-led-halt.service — startet tidligt ved opstart uden at gøre noget, så dens ExecStop kører sent i nedlukningen — slukker lampen (pinctrl) lige før kernen standser. Mørk lampe = strømmen må tages fra. En standset Pi Zero kan ikke startes med magneten; afbryd og tilslut strømmen.</w:t>
+      </w:r>
+    </w:p>
+    <w:tbl>
+      <w:tblPr>
+        <w:tblStyle w:val="TableGrid"/>
+        <w:tblW w:type="auto" w:w="0"/>
+        <w:jc w:val="center"/>
+        <w:tblLook w:firstColumn="1" w:firstRow="1" w:lastColumn="0" w:lastRow="0" w:noHBand="0" w:noVBand="1" w:val="04A0"/>
+      </w:tblPr>
+      <w:tblGrid>
+        <w:gridCol w:w="3061"/>
+        <w:gridCol w:w="3061"/>
+        <w:gridCol w:w="3061"/>
+      </w:tblGrid>
+      <w:tr>
+        <w:tc>
+          <w:tcPr>
+            <w:tcW w:type="dxa" w:w="1247"/>
+            <w:shd w:val="clear" w:color="auto" w:fill="2B6CB0"/>
+          </w:tcPr>
+          <w:p>
+            <w:pPr>
+              <w:spacing w:after="40"/>
+            </w:pPr>
+            <w:r>
+              <w:rPr>
+                <w:rFonts w:ascii="Segoe UI" w:hAnsi="Segoe UI"/>
+                <w:b/>
+                <w:color w:val="FFFFFF"/>
+                <w:sz w:val="19"/>
+              </w:rPr>
+              <w:t>Hold</w:t>
+            </w:r>
+          </w:p>
+        </w:tc>
+        <w:tc>
+          <w:tcPr>
+            <w:tcW w:type="dxa" w:w="2494"/>
+            <w:shd w:val="clear" w:color="auto" w:fill="2B6CB0"/>
+          </w:tcPr>
+          <w:p>
+            <w:pPr>
+              <w:spacing w:after="40"/>
+            </w:pPr>
+            <w:r>
+              <w:rPr>
+                <w:rFonts w:ascii="Segoe UI" w:hAnsi="Segoe UI"/>
+                <w:b/>
+                <w:color w:val="FFFFFF"/>
+                <w:sz w:val="19"/>
+              </w:rPr>
+              <w:t>Lampen mens du holder</w:t>
+            </w:r>
+          </w:p>
+        </w:tc>
+        <w:tc>
+          <w:tcPr>
+            <w:tcW w:type="dxa" w:w="5102"/>
+            <w:shd w:val="clear" w:color="auto" w:fill="2B6CB0"/>
+          </w:tcPr>
+          <w:p>
+            <w:pPr>
+              <w:spacing w:after="40"/>
+            </w:pPr>
+            <w:r>
+              <w:rPr>
+                <w:rFonts w:ascii="Segoe UI" w:hAnsi="Segoe UI"/>
+                <w:b/>
+                <w:color w:val="FFFFFF"/>
+                <w:sz w:val="19"/>
+              </w:rPr>
+              <w:t>Ved slip</w:t>
+            </w:r>
+          </w:p>
+        </w:tc>
+      </w:tr>
+      <w:tr>
+        <w:tc>
+          <w:tcPr>
+            <w:tcW w:type="dxa" w:w="1247"/>
+          </w:tcPr>
+          <w:p>
+            <w:pPr>
+              <w:spacing w:after="40"/>
+            </w:pPr>
+            <w:r>
+              <w:rPr>
+                <w:rFonts w:ascii="Segoe UI" w:hAnsi="Segoe UI"/>
+                <w:sz w:val="19"/>
+              </w:rPr>
+              <w:t>under 3 s</w:t>
+            </w:r>
+          </w:p>
+        </w:tc>
+        <w:tc>
+          <w:tcPr>
+            <w:tcW w:type="dxa" w:w="2494"/>
+          </w:tcPr>
+          <w:p>
+            <w:pPr>
+              <w:spacing w:after="40"/>
+            </w:pPr>
+            <w:r>
+              <w:rPr>
+                <w:rFonts w:ascii="Segoe UI" w:hAnsi="Segoe UI"/>
+                <w:sz w:val="19"/>
+              </w:rPr>
+              <w:t>statusfarve</w:t>
+            </w:r>
+          </w:p>
+        </w:tc>
+        <w:tc>
+          <w:tcPr>
+            <w:tcW w:type="dxa" w:w="5102"/>
+          </w:tcPr>
+          <w:p>
+            <w:pPr>
+              <w:spacing w:after="40"/>
+            </w:pPr>
+            <w:r>
+              <w:rPr>
+                <w:rFonts w:ascii="Segoe UI" w:hAnsi="Segoe UI"/>
+                <w:sz w:val="19"/>
+              </w:rPr>
+              <w:t>status i 30 s</w:t>
+            </w:r>
+          </w:p>
+        </w:tc>
+      </w:tr>
+      <w:tr>
+        <w:tc>
+          <w:tcPr>
+            <w:tcW w:type="dxa" w:w="1247"/>
+            <w:shd w:val="clear" w:color="auto" w:fill="F7FAFC"/>
+          </w:tcPr>
+          <w:p>
+            <w:pPr>
+              <w:spacing w:after="40"/>
+            </w:pPr>
+            <w:r>
+              <w:rPr>
+                <w:rFonts w:ascii="Segoe UI" w:hAnsi="Segoe UI"/>
+                <w:sz w:val="19"/>
+              </w:rPr>
+              <w:t>3 s</w:t>
+            </w:r>
+          </w:p>
+        </w:tc>
+        <w:tc>
+          <w:tcPr>
+            <w:tcW w:type="dxa" w:w="2494"/>
+            <w:shd w:val="clear" w:color="auto" w:fill="F7FAFC"/>
+          </w:tcPr>
+          <w:p>
+            <w:pPr>
+              <w:spacing w:after="40"/>
+            </w:pPr>
+            <w:r>
+              <w:rPr>
+                <w:rFonts w:ascii="Segoe UI" w:hAnsi="Segoe UI"/>
+                <w:sz w:val="19"/>
+              </w:rPr>
+              <w:t>blå blink</w:t>
+            </w:r>
+          </w:p>
+        </w:tc>
+        <w:tc>
+          <w:tcPr>
+            <w:tcW w:type="dxa" w:w="5102"/>
+            <w:shd w:val="clear" w:color="auto" w:fill="F7FAFC"/>
+          </w:tcPr>
+          <w:p>
+            <w:pPr>
+              <w:spacing w:after="40"/>
+            </w:pPr>
+            <w:r>
+              <w:rPr>
+                <w:rFonts w:ascii="Segoe UI" w:hAnsi="Segoe UI"/>
+                <w:sz w:val="19"/>
+              </w:rPr>
+              <w:t>hotspot tændes/slukkes</w:t>
+            </w:r>
+          </w:p>
+        </w:tc>
+      </w:tr>
+      <w:tr>
+        <w:tc>
+          <w:tcPr>
+            <w:tcW w:type="dxa" w:w="1247"/>
+          </w:tcPr>
+          <w:p>
+            <w:pPr>
+              <w:spacing w:after="40"/>
+            </w:pPr>
+            <w:r>
+              <w:rPr>
+                <w:rFonts w:ascii="Segoe UI" w:hAnsi="Segoe UI"/>
+                <w:sz w:val="19"/>
+              </w:rPr>
+              <w:t>6 s</w:t>
+            </w:r>
+          </w:p>
+        </w:tc>
+        <w:tc>
+          <w:tcPr>
+            <w:tcW w:type="dxa" w:w="2494"/>
+          </w:tcPr>
+          <w:p>
+            <w:pPr>
+              <w:spacing w:after="40"/>
+            </w:pPr>
+            <w:r>
+              <w:rPr>
+                <w:rFonts w:ascii="Segoe UI" w:hAnsi="Segoe UI"/>
+                <w:sz w:val="19"/>
+              </w:rPr>
+              <w:t>turkis blink</w:t>
+            </w:r>
+          </w:p>
+        </w:tc>
+        <w:tc>
+          <w:tcPr>
+            <w:tcW w:type="dxa" w:w="5102"/>
+          </w:tcPr>
+          <w:p>
+            <w:pPr>
+              <w:spacing w:after="40"/>
+            </w:pPr>
+            <w:r>
+              <w:rPr>
+                <w:rFonts w:ascii="Segoe UI" w:hAnsi="Segoe UI"/>
+                <w:sz w:val="19"/>
+              </w:rPr>
+              <w:t>kontrolleret nedlukning; turkis → slukket = sikkert at afbryde</w:t>
+            </w:r>
+          </w:p>
+        </w:tc>
+      </w:tr>
+      <w:tr>
+        <w:tc>
+          <w:tcPr>
+            <w:tcW w:type="dxa" w:w="1247"/>
+            <w:shd w:val="clear" w:color="auto" w:fill="F7FAFC"/>
+          </w:tcPr>
+          <w:p>
+            <w:pPr>
+              <w:spacing w:after="40"/>
+            </w:pPr>
+            <w:r>
+              <w:rPr>
+                <w:rFonts w:ascii="Segoe UI" w:hAnsi="Segoe UI"/>
+                <w:sz w:val="19"/>
+              </w:rPr>
+              <w:t>10 s</w:t>
+            </w:r>
+          </w:p>
+        </w:tc>
+        <w:tc>
+          <w:tcPr>
+            <w:tcW w:type="dxa" w:w="2494"/>
+            <w:shd w:val="clear" w:color="auto" w:fill="F7FAFC"/>
+          </w:tcPr>
+          <w:p>
+            <w:pPr>
+              <w:spacing w:after="40"/>
+            </w:pPr>
+            <w:r>
+              <w:rPr>
+                <w:rFonts w:ascii="Segoe UI" w:hAnsi="Segoe UI"/>
+                <w:sz w:val="19"/>
+              </w:rPr>
+              <w:t>lilla blink</w:t>
+            </w:r>
+          </w:p>
+        </w:tc>
+        <w:tc>
+          <w:tcPr>
+            <w:tcW w:type="dxa" w:w="5102"/>
+            <w:shd w:val="clear" w:color="auto" w:fill="F7FAFC"/>
+          </w:tcPr>
+          <w:p>
+            <w:pPr>
+              <w:spacing w:after="40"/>
+            </w:pPr>
+            <w:r>
+              <w:rPr>
+                <w:rFonts w:ascii="Segoe UI" w:hAnsi="Segoe UI"/>
+                <w:sz w:val="19"/>
+              </w:rPr>
+              <w:t>drift ↔ udvikling (afsnit 5.5)</w:t>
+            </w:r>
+          </w:p>
+        </w:tc>
+      </w:tr>
+      <w:tr>
+        <w:tc>
+          <w:tcPr>
+            <w:tcW w:type="dxa" w:w="1247"/>
+          </w:tcPr>
+          <w:p>
+            <w:pPr>
+              <w:spacing w:after="40"/>
+            </w:pPr>
+            <w:r>
+              <w:rPr>
+                <w:rFonts w:ascii="Segoe UI" w:hAnsi="Segoe UI"/>
+                <w:sz w:val="19"/>
+              </w:rPr>
+              <w:t>15 s</w:t>
+            </w:r>
+          </w:p>
+        </w:tc>
+        <w:tc>
+          <w:tcPr>
+            <w:tcW w:type="dxa" w:w="2494"/>
+          </w:tcPr>
+          <w:p>
+            <w:pPr>
+              <w:spacing w:after="40"/>
+            </w:pPr>
+            <w:r>
+              <w:rPr>
+                <w:rFonts w:ascii="Segoe UI" w:hAnsi="Segoe UI"/>
+                <w:sz w:val="19"/>
+              </w:rPr>
+              <w:t>rød blink</w:t>
+            </w:r>
+          </w:p>
+        </w:tc>
+        <w:tc>
+          <w:tcPr>
+            <w:tcW w:type="dxa" w:w="5102"/>
+          </w:tcPr>
+          <w:p>
+            <w:pPr>
+              <w:spacing w:after="40"/>
+            </w:pPr>
+            <w:r>
+              <w:rPr>
+                <w:rFonts w:ascii="Segoe UI" w:hAnsi="Segoe UI"/>
+                <w:sz w:val="19"/>
+              </w:rPr>
+              <w:t>netværksnulstilling og genstart (afsnit 5.4)</w:t>
+            </w:r>
+          </w:p>
+        </w:tc>
+      </w:tr>
+      <w:tr>
+        <w:tc>
+          <w:tcPr>
+            <w:tcW w:type="dxa" w:w="1247"/>
+            <w:shd w:val="clear" w:color="auto" w:fill="F7FAFC"/>
+          </w:tcPr>
+          <w:p>
+            <w:pPr>
+              <w:spacing w:after="40"/>
+            </w:pPr>
+            <w:r>
+              <w:rPr>
+                <w:rFonts w:ascii="Segoe UI" w:hAnsi="Segoe UI"/>
+                <w:sz w:val="19"/>
+              </w:rPr>
+              <w:t>20 s</w:t>
+            </w:r>
+          </w:p>
+        </w:tc>
+        <w:tc>
+          <w:tcPr>
+            <w:tcW w:type="dxa" w:w="2494"/>
+            <w:shd w:val="clear" w:color="auto" w:fill="F7FAFC"/>
+          </w:tcPr>
+          <w:p>
+            <w:pPr>
+              <w:spacing w:after="40"/>
+            </w:pPr>
+            <w:r>
+              <w:rPr>
+                <w:rFonts w:ascii="Segoe UI" w:hAnsi="Segoe UI"/>
+                <w:sz w:val="19"/>
+              </w:rPr>
+              <w:t>slukket</w:t>
+            </w:r>
+          </w:p>
+        </w:tc>
+        <w:tc>
+          <w:tcPr>
+            <w:tcW w:type="dxa" w:w="5102"/>
+            <w:shd w:val="clear" w:color="auto" w:fill="F7FAFC"/>
+          </w:tcPr>
+          <w:p>
+            <w:pPr>
+              <w:spacing w:after="40"/>
+            </w:pPr>
+            <w:r>
+              <w:rPr>
+                <w:rFonts w:ascii="Segoe UI" w:hAnsi="Segoe UI"/>
+                <w:sz w:val="19"/>
+              </w:rPr>
+              <w:t>fortryd — der sker ingenting</w:t>
+            </w:r>
+          </w:p>
+        </w:tc>
+      </w:tr>
+    </w:tbl>
+    <w:p>
+      <w:pPr>
+        <w:spacing w:before="60" w:after="240"/>
+        <w:jc w:val="center"/>
+      </w:pPr>
+      <w:r>
+        <w:rPr>
+          <w:rFonts w:ascii="Segoe UI" w:hAnsi="Segoe UI"/>
+          <w:i/>
+          <w:color w:val="606C80"/>
+          <w:sz w:val="18"/>
+        </w:rPr>
+        <w:t>Tabel 21. Hele magnet-stigen. Lampen skifter ved hver tærskel, og handlingen udføres først ved slip.</w:t>
+      </w:r>
+    </w:p>
+    <w:p>
       <w:r>
         <w:br w:type="page"/>
       </w:r>
@@ -13220,7 +13712,7 @@
           <w:color w:val="606C80"/>
           <w:sz w:val="18"/>
         </w:rPr>
-        <w:t>Tabel 21. Udløsere for hotspottet, evalueret af net_provision_hotspot.sh i den viste rækkefølge. Anmodningsfilen virker når som helst; de øvrige kun ved opstart.</w:t>
+        <w:t>Tabel 22. Udløsere for hotspottet, evalueret af net_provision_hotspot.sh i den viste rækkefølge. Anmodningsfilen virker når som helst; de øvrige kun ved opstart.</w:t>
       </w:r>
     </w:p>
     <w:p>
@@ -13616,7 +14108,7 @@
           <w:color w:val="606C80"/>
           <w:sz w:val="18"/>
         </w:rPr>
-        <w:t>Tabel 22. Setup-UI'ets sider på /setup/.</w:t>
+        <w:t>Tabel 23. Setup-UI'ets sider på /setup/.</w:t>
       </w:r>
     </w:p>
     <w:p>
@@ -13635,7 +14127,7 @@
           <w:i w:val="0"/>
           <w:sz w:val="21"/>
         </w:rPr>
-        <w:t>Magneten holdt i 10 sekunder sletter alle Wi-Fi-profiler undtagen ipr-hotspot og genstarter enheden. Applikationsindstillinger, brugerkonti og logfiler berøres ikke. Samme resultat opnås manuelt:</w:t>
+        <w:t>Magneten holdt i 15 sekunder sletter alle Wi-Fi-profiler undtagen ipr-hotspot og genstarter enheden. Applikationsindstillinger, brugerkonti og logfiler berøres ikke. Samme resultat opnås manuelt:</w:t>
       </w:r>
     </w:p>
     <w:p>
@@ -13873,7 +14365,7 @@
           <w:color w:val="606C80"/>
           <w:sz w:val="18"/>
         </w:rPr>
-        <w:t>Tabel 23. Åbne porte pr. tilstand. Loopback, svar på enhedens egen udgående trafik, ICMP og DHCP-klientsvar er altid tilladt; udgående trafik filtreres ikke. Bluetooth er ikke IP og berøres ikke.</w:t>
+        <w:t>Tabel 24. Åbne porte pr. tilstand. Loopback, svar på enhedens egen udgående trafik, ICMP og DHCP-klientsvar er altid tilladt; udgående trafik filtreres ikke. Bluetooth er ikke IP og berøres ikke.</w:t>
       </w:r>
     </w:p>
     <w:p>
@@ -13895,7 +14387,7 @@
           <w:i w:val="0"/>
           <w:sz w:val="21"/>
         </w:rPr>
-        <w:t>Tilstanden skiftes med magneten (hold i 6 sekunder — lampen blinker lilla — og slip; lampen lyser lilla i 3 sekunder som bekræftelse) eller fra kommandolinjen:</w:t>
+        <w:t>Tilstanden skiftes med magneten (hold i 10 sekunder — lampen blinker lilla — og slip; lampen lyser lilla i 3 sekunder som bekræftelse) eller fra kommandolinjen:</w:t>
       </w:r>
     </w:p>
     <w:p>
@@ -13983,7 +14475,7 @@
           <w:i w:val="0"/>
           <w:sz w:val="21"/>
         </w:rPr>
-        <w:t>Sådan afprøves lampen i udviklingstilstand: skift med magneten (6 s) — lampen lyser lilla i 3 sekunder og blinker derefter kort lilla hvert 4. sekund; en berøring viser statusfarven oven i. Fra en anden maskine virker ssh og dashboardet nu; sudo ipr-firewall.sh status viser tilstand, hotspot og regler. Skift tilbage med magneten: SSH-sessionen falder, og det lilla blink stopper.</w:t>
+        <w:t>Sådan afprøves lampen i udviklingstilstand: skift med magneten (10 s) — lampen lyser lilla i 3 sekunder og blinker derefter kort lilla hvert 4. sekund; en berøring viser statusfarven oven i. Fra en anden maskine virker ssh og dashboardet nu; sudo ipr-firewall.sh status viser tilstand, hotspot og regler. Skift tilbage med magneten: SSH-sessionen falder, og det lilla blink stopper.</w:t>
       </w:r>
     </w:p>
     <w:p>
@@ -14012,7 +14504,7 @@
           <w:rFonts w:ascii="Segoe UI" w:hAnsi="Segoe UI"/>
           <w:sz w:val="20"/>
         </w:rPr>
-        <w:t>Provisioneringen efterlader enheden i udviklingstilstand, fordi den kører over SSH og ellers ville afbryde sig selv. Idriftsættelsen afsluttes med sudo ipr_mode_ctl.sh production (eller magneten i 6 sekunder). Skiftet til drift over en SSH-forbindelse på hjemmenettet afbryder forbindelsen — det er meningen. test_provision.sh advarer, så længe enheden står i udviklingstilstand.</w:t>
+        <w:t>Provisioneringen efterlader enheden i udviklingstilstand, fordi den kører over SSH og ellers ville afbryde sig selv. Idriftsættelsen afsluttes med sudo ipr_mode_ctl.sh production (eller magneten i 10 sekunder). Skiftet til drift over en SSH-forbindelse på hjemmenettet afbryder forbindelsen — det er meningen. test_provision.sh advarer, så længe enheden står i udviklingstilstand.</w:t>
       </w:r>
     </w:p>
     <w:p>
@@ -14254,7 +14746,7 @@
           <w:color w:val="606C80"/>
           <w:sz w:val="18"/>
         </w:rPr>
-        <w:t>Tabel 24. Rollernes rettigheder.</w:t>
+        <w:t>Tabel 25. Rollernes rettigheder.</w:t>
       </w:r>
     </w:p>
     <w:p>
@@ -14516,7 +15008,7 @@
                 <w:rFonts w:ascii="Segoe UI" w:hAnsi="Segoe UI"/>
                 <w:sz w:val="19"/>
               </w:rPr>
-              <w:t>I driftstilstand er ingen port åben på hjemmenettet (nftables, politik DROP). Hotspottet er slukket som standard og kræver fysisk tilstedeværelse (magnet, strømcykling eller SD-kort); tændt eksponerer det kun setup-portalen. SSH og dashboard på hjemmenettet kræver udviklingstilstand (magnet 6 s). Se afsnit 5.5.</w:t>
+              <w:t>I driftstilstand er ingen port åben på hjemmenettet (nftables, politik DROP). Hotspottet er slukket som standard og kræver fysisk tilstedeværelse (magnet 3 s, strømcykling eller SD-kort); tændt eksponerer det kun setup-portalen. SSH og dashboard på hjemmenettet kræver udviklingstilstand (magnet 10 s). Se afsnit 5.5.</w:t>
             </w:r>
           </w:p>
         </w:tc>
@@ -14868,7 +15360,7 @@
           <w:color w:val="606C80"/>
           <w:sz w:val="18"/>
         </w:rPr>
-        <w:t>Tabel 25. Sikkerhedsfunktioner i den leverede løsning.</w:t>
+        <w:t>Tabel 26. Sikkerhedsfunktioner i den leverede løsning.</w:t>
       </w:r>
     </w:p>
     <w:p>
@@ -14900,7 +15392,7 @@
           <w:rFonts w:ascii="Segoe UI" w:hAnsi="Segoe UI"/>
           <w:sz w:val="21"/>
         </w:rPr>
-        <w:t>Sæt enheden i driftstilstand som det allersidste trin: sudo ipr_mode_ctl.sh production, eller magneten i 6 sekunder. Kontrollér med sudo ipr-firewall.sh status og — fra en anden maskine — at SSH og dashboardet ikke længere svarer.</w:t>
+        <w:t>Sæt enheden i driftstilstand som det allersidste trin: sudo ipr_mode_ctl.sh production, eller magneten i 10 sekunder. Kontrollér med sudo ipr-firewall.sh status og — fra en anden maskine — at SSH og dashboardet ikke længere svarer.</w:t>
       </w:r>
     </w:p>
     <w:p>
@@ -15341,7 +15833,7 @@
           <w:color w:val="606C80"/>
           <w:sz w:val="18"/>
         </w:rPr>
-        <w:t>Tabel 26. Kendte risici og anbefalet håndtering.</w:t>
+        <w:t>Tabel 27. Kendte risici og anbefalet håndtering.</w:t>
       </w:r>
     </w:p>
     <w:p>
@@ -15821,7 +16313,7 @@
           <w:color w:val="606C80"/>
           <w:sz w:val="18"/>
         </w:rPr>
-        <w:t>Tabel 27. Målrettede udrulningsskripts i scripts/deploy/.</w:t>
+        <w:t>Tabel 28. Målrettede udrulningsskripts i scripts/deploy/.</w:t>
       </w:r>
     </w:p>
     <w:p>
@@ -16980,7 +17472,7 @@
           <w:color w:val="606C80"/>
           <w:sz w:val="18"/>
         </w:rPr>
-        <w:t>Tabel 28. Hvad der bør holdes øje med i drift.</w:t>
+        <w:t>Tabel 29. Hvad der bør holdes øje med i drift.</w:t>
       </w:r>
     </w:p>
     <w:p>
@@ -17604,7 +18096,7 @@
           <w:color w:val="606C80"/>
           <w:sz w:val="18"/>
         </w:rPr>
-        <w:t>Tabel 29. Ydelsestal, der registreres når MetricsEnabled er slået til. Alle ses under /api/metrics; opstartstid og pen → BLE vises også på dashboardets forside.</w:t>
+        <w:t>Tabel 30. Ydelsestal, der registreres når MetricsEnabled er slået til. Alle ses under /api/metrics; opstartstid og pen → BLE vises også på dashboardets forside.</w:t>
       </w:r>
     </w:p>
     <w:p>
@@ -17999,7 +18491,7 @@
           <w:color w:val="606C80"/>
           <w:sz w:val="18"/>
         </w:rPr>
-        <w:t>Tabel 30. Tre lag, installeret af install_observability.sh.</w:t>
+        <w:t>Tabel 31. Tre lag, installeret af install_observability.sh.</w:t>
       </w:r>
     </w:p>
     <w:p>
@@ -18943,7 +19435,7 @@
           <w:color w:val="606C80"/>
           <w:sz w:val="18"/>
         </w:rPr>
-        <w:t>Tabel 31. Fejlmønstre på værtssiden.</w:t>
+        <w:t>Tabel 32. Fejlmønstre på værtssiden.</w:t>
       </w:r>
     </w:p>
     <w:p>
@@ -19323,7 +19815,7 @@
           <w:color w:val="606C80"/>
           <w:sz w:val="18"/>
         </w:rPr>
-        <w:t>Tabel 32. Fejlmønstre i web- og netværkslaget.</w:t>
+        <w:t>Tabel 33. Fejlmønstre i web- og netværkslaget.</w:t>
       </w:r>
     </w:p>
     <w:p>
@@ -19730,7 +20222,7 @@
                 <w:rFonts w:ascii="Segoe UI" w:hAnsi="Segoe UI"/>
                 <w:sz w:val="19"/>
               </w:rPr>
-              <w:t>Hold magneten i 6 sekunder (lilla blink) og slip: udviklingstilstand, lampen blinker lilla hvert 4. sekund. Eller brug hotspottet (magnet 3 s).</w:t>
+              <w:t>Hold magneten i 10 sekunder (lilla blink) og slip: udviklingstilstand, lampen blinker lilla hvert 4. sekund. Eller brug hotspottet (magnet 3 s).</w:t>
             </w:r>
           </w:p>
         </w:tc>
@@ -19749,7 +20241,7 @@
                 <w:rFonts w:ascii="Segoe UI" w:hAnsi="Segoe UI"/>
                 <w:sz w:val="19"/>
               </w:rPr>
-              <w:t>Lampen lyser konstant rødt.</w:t>
+              <w:t>Lampen lyser konstant turkis og går ikke ud.</w:t>
             </w:r>
           </w:p>
         </w:tc>
@@ -19766,7 +20258,7 @@
                 <w:rFonts w:ascii="Segoe UI" w:hAnsi="Segoe UI"/>
                 <w:sz w:val="19"/>
               </w:rPr>
-              <w:t>En kerneenhed er ikke aktiv.</w:t>
+              <w:t>Nedlukningen hænger, eller ipr-led-halt.service er ikke installeret/aktiveret.</w:t>
             </w:r>
           </w:p>
         </w:tc>
@@ -19783,7 +20275,7 @@
                 <w:rFonts w:ascii="Segoe UI" w:hAnsi="Segoe UI"/>
                 <w:sz w:val="19"/>
               </w:rPr>
-              <w:t>systemctl is-active bluetooth bt_hid_ble bt_hid_agent_unified; cat /var/lib/ipr-keyboard/incidents.log; journalctl -u &lt;enhed&gt;.</w:t>
+              <w:t>Vent op til et minut. Ellers: systemctl is-enabled ipr-led-halt.service; kør install_gpio_support.sh igen. Afbryd strømmen først, når lampen er slukket.</w:t>
             </w:r>
           </w:p>
         </w:tc>
@@ -19803,7 +20295,7 @@
                 <w:rFonts w:ascii="Segoe UI" w:hAnsi="Segoe UI"/>
                 <w:sz w:val="19"/>
               </w:rPr>
-              <w:t>Hvidt blink i flere minutter.</w:t>
+              <w:t>Lampen lyser konstant rødt.</w:t>
             </w:r>
           </w:p>
         </w:tc>
@@ -19821,7 +20313,7 @@
                 <w:rFonts w:ascii="Segoe UI" w:hAnsi="Segoe UI"/>
                 <w:sz w:val="19"/>
               </w:rPr>
-              <w:t>Boot-blinkeren blev ikke stoppet (appen logger “GPIO busy”), eller dashboardet svarede aldrig på LogPort.</w:t>
+              <w:t>En kerneenhed er ikke aktiv.</w:t>
             </w:r>
           </w:p>
         </w:tc>
@@ -19829,6 +20321,59 @@
           <w:tcPr>
             <w:tcW w:type="dxa" w:w="3628"/>
             <w:shd w:val="clear" w:color="auto" w:fill="F7FAFC"/>
+          </w:tcPr>
+          <w:p>
+            <w:pPr>
+              <w:spacing w:after="40"/>
+            </w:pPr>
+            <w:r>
+              <w:rPr>
+                <w:rFonts w:ascii="Segoe UI" w:hAnsi="Segoe UI"/>
+                <w:sz w:val="19"/>
+              </w:rPr>
+              <w:t>systemctl is-active bluetooth bt_hid_ble bt_hid_agent_unified; cat /var/lib/ipr-keyboard/incidents.log; journalctl -u &lt;enhed&gt;.</w:t>
+            </w:r>
+          </w:p>
+        </w:tc>
+      </w:tr>
+      <w:tr>
+        <w:tc>
+          <w:tcPr>
+            <w:tcW w:type="dxa" w:w="2608"/>
+          </w:tcPr>
+          <w:p>
+            <w:pPr>
+              <w:spacing w:after="40"/>
+            </w:pPr>
+            <w:r>
+              <w:rPr>
+                <w:rFonts w:ascii="Segoe UI" w:hAnsi="Segoe UI"/>
+                <w:sz w:val="19"/>
+              </w:rPr>
+              <w:t>Hvidt blink i flere minutter.</w:t>
+            </w:r>
+          </w:p>
+        </w:tc>
+        <w:tc>
+          <w:tcPr>
+            <w:tcW w:type="dxa" w:w="2608"/>
+          </w:tcPr>
+          <w:p>
+            <w:pPr>
+              <w:spacing w:after="40"/>
+            </w:pPr>
+            <w:r>
+              <w:rPr>
+                <w:rFonts w:ascii="Segoe UI" w:hAnsi="Segoe UI"/>
+                <w:sz w:val="19"/>
+              </w:rPr>
+              <w:t>Boot-blinkeren blev ikke stoppet (appen logger “GPIO busy”), eller dashboardet svarede aldrig på LogPort.</w:t>
+            </w:r>
+          </w:p>
+        </w:tc>
+        <w:tc>
+          <w:tcPr>
+            <w:tcW w:type="dxa" w:w="3628"/>
           </w:tcPr>
           <w:p>
             <w:pPr>
@@ -19857,7 +20402,7 @@
           <w:color w:val="606C80"/>
           <w:sz w:val="18"/>
         </w:rPr>
-        <w:t>Tabel 33. Fejlmønstre for statuslampen og reed-kontakten. Fase K i test_provision.sh kontrollerer, at alle dele er installeret.</w:t>
+        <w:t>Tabel 34. Fejlmønstre for statuslampen og reed-kontakten. Fase K i test_provision.sh kontrollerer, at alle dele er installeret.</w:t>
       </w:r>
     </w:p>
     <w:p>
@@ -20334,7 +20879,7 @@
           <w:color w:val="606C80"/>
           <w:sz w:val="18"/>
         </w:rPr>
-        <w:t>Tabel 34. Testniveauer og hvornår de bruges.</w:t>
+        <w:t>Tabel 35. Testniveauer og hvornår de bruges.</w:t>
       </w:r>
     </w:p>
     <w:p>
@@ -20474,6 +21019,18 @@
           <w:sz w:val="21"/>
         </w:rPr>
         <w:t>Med skanneren sat i viser dashboardet “Klar”, og Debug-siden viser dens filer.</w:t>
+      </w:r>
+    </w:p>
+    <w:p>
+      <w:pPr>
+        <w:pStyle w:val="ListNumber"/>
+      </w:pPr>
+      <w:r>
+        <w:rPr>
+          <w:rFonts w:ascii="Segoe UI" w:hAnsi="Segoe UI"/>
+          <w:sz w:val="21"/>
+        </w:rPr>
+        <w:t>Magneten i 6 sekunder lukker enheden ned: turkis, derefter slukket lampe.</w:t>
       </w:r>
     </w:p>
     <w:p>
@@ -20817,7 +21374,7 @@
           <w:color w:val="606C80"/>
           <w:sz w:val="18"/>
         </w:rPr>
-        <w:t>Tabel 35. Dokumentationsdrift, der er værd at kende.</w:t>
+        <w:t>Tabel 36. Dokumentationsdrift, der er værd at kende.</w:t>
       </w:r>
     </w:p>
     <w:p>
@@ -22083,7 +22640,7 @@
           <w:color w:val="606C80"/>
           <w:sz w:val="18"/>
         </w:rPr>
-        <w:t>Tabel 36. Endepunkter, som dashboardet er afhængigt af.</w:t>
+        <w:t>Tabel 37. Endepunkter, som dashboardet er afhængigt af.</w:t>
       </w:r>
     </w:p>
     <w:p>
@@ -23008,7 +23565,7 @@
           <w:color w:val="606C80"/>
           <w:sz w:val="18"/>
         </w:rPr>
-        <w:t>Tabel 37. Billeder, der skal produceres eksternt, med den ønskede placering.</w:t>
+        <w:t>Tabel 38. Billeder, der skal produceres eksternt, med den ønskede placering.</w:t>
       </w:r>
     </w:p>
     <w:p>
@@ -23177,7 +23734,7 @@
         <w:color w:val="606C80"/>
         <w:sz w:val="16"/>
       </w:rPr>
-      <w:t xml:space="preserve">IPR-DOC-002 · Administratormanual · version 1.8.2   ·   Side </w:t>
+      <w:t xml:space="preserve">IPR-DOC-002 · Administratormanual · version 1.9.0   ·   Side </w:t>
     </w:r>
     <w:r>
       <w:rPr>

</xml_diff>

<commit_message>
feat(web): Device card with hotspot controls; dark LED on press; metric definitions
Home page gains a Device card (mode, hotspot with SSID, network and IP,
incident count, a one-line reachability hint) fed by GET /api/device, with
Start/Stop hotspot buttons for admins (POST /api/actions/hotspot, same helper
as the magnet, start needs confirm because the device leaves the home
network). A short text under the performance boxes says what each number is
(boot to app; pen->BT for one whole scan; hand-off per character).

LED: the "3 s blue blink" was invisible on top of "solid blue" (hotspot on).
The LED now goes dark the moment the magnet is detected, so every arming
colour blinks against dark. Manuals user 1.6 / admin 1.9.1, docs, api-contract.

Co-Authored-By: Claude Opus 5 (1M context) <noreply@anthropic.com>
Claude-Session: https://claude.ai/code/session_01GX15fqsPoufJXa3hdJmFWm
</commit_message>
<xml_diff>
--- a/docs/manuals/Administratormanual_IPR_Pen_Bridge.docx
+++ b/docs/manuals/Administratormanual_IPR_Pen_Bridge.docx
@@ -101,7 +101,7 @@
                 <w:rFonts w:ascii="Segoe UI" w:hAnsi="Segoe UI"/>
                 <w:sz w:val="20"/>
               </w:rPr>
-              <w:t>1.9.0</w:t>
+              <w:t>1.9.1</w:t>
             </w:r>
           </w:p>
         </w:tc>
@@ -11014,6 +11014,17 @@
           <w:i w:val="0"/>
           <w:sz w:val="21"/>
         </w:rPr>
+        <w:t>Forsidens boks “Device” viser tilstand (drift/udvikling), om hotspottet er tændt (med SSID), hvilket netværk enheden er på med IP-adresse, antal registrerede hændelser (afsnit 9.5) og en sætning om, hvor enheden kan nås. Administratorer får knapperne Start hotspot / Stop hotspot; start kræver bekræftelse, fordi enheden forlader hjemmenettet, mens hotspottet er tændt — siden holder op med at svare dér og nås igen på https://10.42.0.1/login. Knapperne bruger samme hjælper som magneten (ipr_hotspot_ctl.sh); API: GET /api/device, POST /api/actions/hotspot.</w:t>
+      </w:r>
+    </w:p>
+    <w:p>
+      <w:r>
+        <w:rPr>
+          <w:rFonts w:ascii="Segoe UI" w:hAnsi="Segoe UI"/>
+          <w:b w:val="0"/>
+          <w:i w:val="0"/>
+          <w:sz w:val="21"/>
+        </w:rPr>
         <w:t>Skærmen Indstillinger dækker de felter, der normalt skal ændres i drift:</w:t>
       </w:r>
     </w:p>
@@ -12851,7 +12862,7 @@
                 <w:rFonts w:ascii="Segoe UI" w:hAnsi="Segoe UI"/>
                 <w:sz w:val="19"/>
               </w:rPr>
-              <w:t>statusfarve</w:t>
+              <w:t>slukket (magneten er registreret)</w:t>
             </w:r>
           </w:p>
         </w:tc>
@@ -13160,7 +13171,7 @@
           <w:color w:val="606C80"/>
           <w:sz w:val="18"/>
         </w:rPr>
-        <w:t>Tabel 21. Hele magnet-stigen. Lampen skifter ved hver tærskel, og handlingen udføres først ved slip.</w:t>
+        <w:t>Tabel 21. Hele magnet-stigen. Lampen slukker, så snart magneten registreres, og skifter ved hver tærskel — blinkene ses derfor altid mod en mørk lampe, også når den lyste konstant blåt (hotspot) inden. Handlingen udføres først ved slip.</w:t>
       </w:r>
     </w:p>
     <w:p>
@@ -18096,7 +18107,7 @@
           <w:color w:val="606C80"/>
           <w:sz w:val="18"/>
         </w:rPr>
-        <w:t>Tabel 30. Ydelsestal, der registreres når MetricsEnabled er slået til. Alle ses under /api/metrics; opstartstid og pen → BLE vises også på dashboardets forside.</w:t>
+        <w:t>Tabel 30. Ydelsestal, der registreres når MetricsEnabled er slået til. Alle ses under /api/metrics; opstartstid, pen → BLE (median og langsomste 5 %) og overdragelse pr. tegn vises også på dashboardets forside med en kort forklaring under tallene. Pen → BLE gælder én hel skanning (én fil); pr. tegn er overdragelsestiden divideret med antal tegn i skanningen.</w:t>
       </w:r>
     </w:p>
     <w:p>
@@ -23734,7 +23745,7 @@
         <w:color w:val="606C80"/>
         <w:sz w:val="16"/>
       </w:rPr>
-      <w:t xml:space="preserve">IPR-DOC-002 · Administratormanual · version 1.9.0   ·   Side </w:t>
+      <w:t xml:space="preserve">IPR-DOC-002 · Administratormanual · version 1.9.1   ·   Side </w:t>
     </w:r>
     <w:r>
       <w:rPr>

</xml_diff>

<commit_message>
fix(net): <host>.local resolves to IPv4; boot-to-app survives service restarts
Windows resolved ipr-prod-zero2.local only to the Pi's SLAAC IPv6 address
(avahi published AAAA), and the dashboard listens on 0.0.0.0, so the name
failed while the IP worked. install_firewall.sh now sets avahi to IPv4 only.

Boot-to-app is measured at the first start after a boot; that figure is now
kept in tmpfs and read back by later service restarts, so the dashboard
shows the current boot's value instead of "n/a (app restarted)".
Admin manual 1.9.2.

Co-Authored-By: Claude Opus 5 (1M context) <noreply@anthropic.com>
Claude-Session: https://claude.ai/code/session_01GX15fqsPoufJXa3hdJmFWm
</commit_message>
<xml_diff>
--- a/docs/manuals/Administratormanual_IPR_Pen_Bridge.docx
+++ b/docs/manuals/Administratormanual_IPR_Pen_Bridge.docx
@@ -101,7 +101,7 @@
                 <w:rFonts w:ascii="Segoe UI" w:hAnsi="Segoe UI"/>
                 <w:sz w:val="20"/>
               </w:rPr>
-              <w:t>1.9.1</w:t>
+              <w:t>1.9.2</w:t>
             </w:r>
           </w:p>
         </w:tc>
@@ -17763,7 +17763,7 @@
                 <w:rFonts w:ascii="Segoe UI" w:hAnsi="Segoe UI"/>
                 <w:sz w:val="19"/>
               </w:rPr>
-              <w:t>Læses én gang ved start. Vises altid, også når målingen er slået fra.</w:t>
+              <w:t>Måles ved første start efter hver opstart og huskes (tmpfs), så en genstart af tjenesten ikke ændrer tallet. Vises altid, også når målingen er slået fra.</w:t>
             </w:r>
           </w:p>
         </w:tc>
@@ -19719,7 +19719,7 @@
                 <w:rFonts w:ascii="Segoe UI" w:hAnsi="Segoe UI"/>
                 <w:sz w:val="19"/>
               </w:rPr>
-              <w:t>Kan ikke nå &lt;værtsnavn&gt;.local.</w:t>
+              <w:t>Kan ikke nå &lt;værtsnavn&gt;.local, men IP-adressen virker.</w:t>
             </w:r>
           </w:p>
         </w:tc>
@@ -19737,7 +19737,7 @@
                 <w:rFonts w:ascii="Segoe UI" w:hAnsi="Segoe UI"/>
                 <w:sz w:val="19"/>
               </w:rPr>
-              <w:t>mDNS er ikke tilgængeligt på nettet.</w:t>
+              <w:t>Navnet slås op til en IPv6-adresse (Windows foretrækker AAAA), og dashboardet lytter kun på IPv4 — eller enheden er i drift (mDNS lukket).</w:t>
             </w:r>
           </w:p>
         </w:tc>
@@ -19755,7 +19755,7 @@
                 <w:rFonts w:ascii="Segoe UI" w:hAnsi="Segoe UI"/>
                 <w:sz w:val="19"/>
               </w:rPr>
-              <w:t>Brug IP-adressen direkte, eller opret en DNS-post.</w:t>
+              <w:t>install_firewall.sh sætter avahi til kun IPv4 (use-ipv6=no); kør den igen på ældre enheder. I drift virker navnet ikke — brug hotspottet. Ellers brug IP-adressen.</w:t>
             </w:r>
           </w:p>
         </w:tc>
@@ -23745,7 +23745,7 @@
         <w:color w:val="606C80"/>
         <w:sz w:val="16"/>
       </w:rPr>
-      <w:t xml:space="preserve">IPR-DOC-002 · Administratormanual · version 1.9.1   ·   Side </w:t>
+      <w:t xml:space="preserve">IPR-DOC-002 · Administratormanual · version 1.9.2   ·   Side </w:t>
     </w:r>
     <w:r>
       <w:rPr>

</xml_diff>

<commit_message>
fix(bt): FIFO owned by the app user; failed sends keep the scan; readable errors
Every scan on the production device was lost: bt_hid_ble_daemon.py created
/run/ipr_bt_keyboard_fifo as root 0600, bt_kb_send's "sudo chmod 666"
fallback only ever worked on the dev Pi (passwordless sudo), the send failed
with exit 1 and the app deleted the file regardless. The daemon now chowns the
FIFO to APP_USER (/opt/ipr_common.env), bt_kb_send no longer escalates, a
scan whose send failed stays on the pen, and the event/log line carries the
helper's own error instead of the whole text. test_provision C.4b checks the
FIFO is writable by the app user.

Events page: the raw-log panel is 60vh tall and resizable (was 300 px).
Admin manual 1.9.3.

Co-Authored-By: Claude Opus 5 (1M context) <noreply@anthropic.com>
Claude-Session: https://claude.ai/code/session_01GX15fqsPoufJXa3hdJmFWm
</commit_message>
<xml_diff>
--- a/docs/manuals/Administratormanual_IPR_Pen_Bridge.docx
+++ b/docs/manuals/Administratormanual_IPR_Pen_Bridge.docx
@@ -101,7 +101,7 @@
                 <w:rFonts w:ascii="Segoe UI" w:hAnsi="Segoe UI"/>
                 <w:sz w:val="20"/>
               </w:rPr>
-              <w:t>1.9.2</w:t>
+              <w:t>1.9.3</w:t>
             </w:r>
           </w:p>
         </w:tc>
@@ -17211,7 +17211,7 @@
                 <w:rFonts w:ascii="Segoe UI" w:hAnsi="Segoe UI"/>
                 <w:sz w:val="19"/>
               </w:rPr>
-              <w:t>Monteringspunkt for skanneren</w:t>
+              <w:t>FIFO'ens ejer</w:t>
             </w:r>
           </w:p>
         </w:tc>
@@ -17229,7 +17229,7 @@
                 <w:rFonts w:ascii="Segoe UI" w:hAnsi="Segoe UI"/>
                 <w:sz w:val="19"/>
               </w:rPr>
-              <w:t>mountpoint /mnt/irispen er sandt, irispen-mount.service active, når skanneren sidder i</w:t>
+              <w:t>ls -l /run/ipr_bt_keyboard_fifo viser applikationsbrugeren (ikke root)</w:t>
             </w:r>
           </w:p>
         </w:tc>
@@ -17247,7 +17247,7 @@
                 <w:rFonts w:ascii="Segoe UI" w:hAnsi="Segoe UI"/>
                 <w:sz w:val="19"/>
               </w:rPr>
-              <w:t>journalctl -u irispen-mount.service; tag USB-stikket ud og i.</w:t>
+              <w:t>Root-ejet: APP_USER mangler i /opt/ipr_common.env, eller en gammel dæmon — kør svc_install_bt_gatt_hid.sh og genstart bt_hid_ble.service. test_provision.sh C.4b kontrollerer det.</w:t>
             </w:r>
           </w:p>
         </w:tc>
@@ -17266,7 +17266,7 @@
                 <w:rFonts w:ascii="Segoe UI" w:hAnsi="Segoe UI"/>
                 <w:sz w:val="19"/>
               </w:rPr>
-              <w:t>Hændelseslog</w:t>
+              <w:t>Monteringspunkt for skanneren</w:t>
             </w:r>
           </w:p>
         </w:tc>
@@ -17283,7 +17283,7 @@
                 <w:rFonts w:ascii="Segoe UI" w:hAnsi="Segoe UI"/>
                 <w:sz w:val="19"/>
               </w:rPr>
-              <w:t>/var/lib/ipr-keyboard/incidents.log er tom</w:t>
+              <w:t>mountpoint /mnt/irispen er sandt, irispen-mount.service active, når skanneren sidder i</w:t>
             </w:r>
           </w:p>
         </w:tc>
@@ -17300,7 +17300,7 @@
                 <w:rFonts w:ascii="Segoe UI" w:hAnsi="Segoe UI"/>
                 <w:sz w:val="19"/>
               </w:rPr>
-              <w:t>Læs linjerne; slå enheden op i journalen (afsnit 9.5).</w:t>
+              <w:t>journalctl -u irispen-mount.service; tag USB-stikket ud og i.</w:t>
             </w:r>
           </w:p>
         </w:tc>
@@ -17320,7 +17320,7 @@
                 <w:rFonts w:ascii="Segoe UI" w:hAnsi="Segoe UI"/>
                 <w:sz w:val="19"/>
               </w:rPr>
-              <w:t>Bluetooth-forbindelse</w:t>
+              <w:t>Hændelseslog</w:t>
             </w:r>
           </w:p>
         </w:tc>
@@ -17338,7 +17338,7 @@
                 <w:rFonts w:ascii="Segoe UI" w:hAnsi="Segoe UI"/>
                 <w:sz w:val="19"/>
               </w:rPr>
-              <w:t>bluetoothctl devices Connected viser værten</w:t>
+              <w:t>/var/lib/ipr-keyboard/incidents.log er tom</w:t>
             </w:r>
           </w:p>
         </w:tc>
@@ -17356,7 +17356,7 @@
                 <w:rFonts w:ascii="Segoe UI" w:hAnsi="Segoe UI"/>
                 <w:sz w:val="19"/>
               </w:rPr>
-              <w:t>Kør parringsdiagnostikken.</w:t>
+              <w:t>Læs linjerne; slå enheden op i journalen (afsnit 9.5).</w:t>
             </w:r>
           </w:p>
         </w:tc>
@@ -17375,7 +17375,7 @@
                 <w:rFonts w:ascii="Segoe UI" w:hAnsi="Segoe UI"/>
                 <w:sz w:val="19"/>
               </w:rPr>
-              <w:t>Certifikatets udløb</w:t>
+              <w:t>Bluetooth-forbindelse</w:t>
             </w:r>
           </w:p>
         </w:tc>
@@ -17392,7 +17392,7 @@
                 <w:rFonts w:ascii="Segoe UI" w:hAnsi="Segoe UI"/>
                 <w:sz w:val="19"/>
               </w:rPr>
-              <w:t>Mere end 30 dage tilbage</w:t>
+              <w:t>bluetoothctl devices Connected viser værten</w:t>
             </w:r>
           </w:p>
         </w:tc>
@@ -17409,7 +17409,7 @@
                 <w:rFonts w:ascii="Segoe UI" w:hAnsi="Segoe UI"/>
                 <w:sz w:val="19"/>
               </w:rPr>
-              <w:t>Kør fornyelsen manuelt.</w:t>
+              <w:t>Kør parringsdiagnostikken.</w:t>
             </w:r>
           </w:p>
         </w:tc>
@@ -17429,7 +17429,7 @@
                 <w:rFonts w:ascii="Segoe UI" w:hAnsi="Segoe UI"/>
                 <w:sz w:val="19"/>
               </w:rPr>
-              <w:t>Diskplads og logstørrelse</w:t>
+              <w:t>Certifikatets udløb</w:t>
             </w:r>
           </w:p>
         </w:tc>
@@ -17447,7 +17447,7 @@
                 <w:rFonts w:ascii="Segoe UI" w:hAnsi="Segoe UI"/>
                 <w:sz w:val="19"/>
               </w:rPr>
-              <w:t>journald inden for sine grænser</w:t>
+              <w:t>Mere end 30 dage tilbage</w:t>
             </w:r>
           </w:p>
         </w:tc>
@@ -17455,6 +17455,59 @@
           <w:tcPr>
             <w:tcW w:type="dxa" w:w="3061"/>
             <w:shd w:val="clear" w:color="auto" w:fill="F7FAFC"/>
+          </w:tcPr>
+          <w:p>
+            <w:pPr>
+              <w:spacing w:after="40"/>
+            </w:pPr>
+            <w:r>
+              <w:rPr>
+                <w:rFonts w:ascii="Segoe UI" w:hAnsi="Segoe UI"/>
+                <w:sz w:val="19"/>
+              </w:rPr>
+              <w:t>Kør fornyelsen manuelt.</w:t>
+            </w:r>
+          </w:p>
+        </w:tc>
+      </w:tr>
+      <w:tr>
+        <w:tc>
+          <w:tcPr>
+            <w:tcW w:type="dxa" w:w="2721"/>
+          </w:tcPr>
+          <w:p>
+            <w:pPr>
+              <w:spacing w:after="40"/>
+            </w:pPr>
+            <w:r>
+              <w:rPr>
+                <w:rFonts w:ascii="Segoe UI" w:hAnsi="Segoe UI"/>
+                <w:sz w:val="19"/>
+              </w:rPr>
+              <w:t>Diskplads og logstørrelse</w:t>
+            </w:r>
+          </w:p>
+        </w:tc>
+        <w:tc>
+          <w:tcPr>
+            <w:tcW w:type="dxa" w:w="3061"/>
+          </w:tcPr>
+          <w:p>
+            <w:pPr>
+              <w:spacing w:after="40"/>
+            </w:pPr>
+            <w:r>
+              <w:rPr>
+                <w:rFonts w:ascii="Segoe UI" w:hAnsi="Segoe UI"/>
+                <w:sz w:val="19"/>
+              </w:rPr>
+              <w:t>journald inden for sine grænser</w:t>
+            </w:r>
+          </w:p>
+        </w:tc>
+        <w:tc>
+          <w:tcPr>
+            <w:tcW w:type="dxa" w:w="3061"/>
           </w:tcPr>
           <w:p>
             <w:pPr>
@@ -18851,6 +18904,35 @@
       </w:r>
     </w:p>
     <w:p>
+      <w:pPr>
+        <w:spacing w:before="120" w:after="200"/>
+        <w:ind w:left="113"/>
+        <w:shd w:val="clear" w:color="auto" w:fill="FFF7E6"/>
+        <w:pBdr>
+          <w:top w:val="single" w:sz="6" w:space="6" w:color="9A6A00"/>
+          <w:left w:val="single" w:sz="6" w:space="6" w:color="9A6A00"/>
+          <w:bottom w:val="single" w:sz="6" w:space="6" w:color="9A6A00"/>
+          <w:right w:val="single" w:sz="6" w:space="6" w:color="9A6A00"/>
+        </w:pBdr>
+      </w:pPr>
+      <w:r>
+        <w:rPr>
+          <w:rFonts w:ascii="Segoe UI" w:hAnsi="Segoe UI"/>
+          <w:b/>
+          <w:color w:val="9A6A00"/>
+          <w:sz w:val="20"/>
+        </w:rPr>
+        <w:t xml:space="preserve">Vigtigt: </w:t>
+      </w:r>
+      <w:r>
+        <w:rPr>
+          <w:rFonts w:ascii="Segoe UI" w:hAnsi="Segoe UI"/>
+          <w:sz w:val="20"/>
+        </w:rPr>
+        <w:t>Beslægtet, set på en produktionsenhed: “BT helper failed: FIFO … is not writable”. Dæmonen oprettede FIFO'en som root med tilstand 0600, så applikationsbrugeren kunne aldrig skrive til den; bt_kb_send forsøgte “sudo chmod 666”, hvilket kun virker på udviklingsenheden med adgangskodefri sudo. Dæmonen ejer nu FIFO'en til APP_USER, bt_kb_send eskalerer ikke længere, og en skanning, hvis afsendelse fejler, slettes ikke fra pennen. Hændelsessiden viser hjælperens egen fejltekst i stedet for hele den tekst, der skulle sendes.</w:t>
+      </w:r>
+    </w:p>
+    <w:p>
       <w:r>
         <w:rPr>
           <w:rFonts w:ascii="Segoe UI" w:hAnsi="Segoe UI"/>
@@ -23745,7 +23827,7 @@
         <w:color w:val="606C80"/>
         <w:sz w:val="16"/>
       </w:rPr>
-      <w:t xml:space="preserve">IPR-DOC-002 · Administratormanual · version 1.9.2   ·   Side </w:t>
+      <w:t xml:space="preserve">IPR-DOC-002 · Administratormanual · version 1.9.3   ·   Side </w:t>
     </w:r>
     <w:r>
       <w:rPr>

</xml_diff>

<commit_message>
fix(web): Reconnect Bluetooth and Debug service buttons go through the root helper
Both ran systemctl from the unprivileged service: "Reconnect Bluetooth" with
no sudo at all (polkit: "Interactive authentication required" - the
"Failed to restart bt_hid_ble.service" journal line), the Debug page with a
sudo the sudoers never granted. ipr_hotspot_ctl.sh gains
`service <start|stop|restart> <unit>` limited to bluetooth,
bt_hid_agent_unified and bt_hid_ble; dbus/udevd stay inspect-only.
Admin manual 1.9.4 notes that a daemon restart drops the BLE link and Windows
may need Connect / BT off-on to come back.

Co-Authored-By: Claude Opus 5 (1M context) <noreply@anthropic.com>
Claude-Session: https://claude.ai/code/session_01GX15fqsPoufJXa3hdJmFWm
</commit_message>
<xml_diff>
--- a/docs/manuals/Administratormanual_IPR_Pen_Bridge.docx
+++ b/docs/manuals/Administratormanual_IPR_Pen_Bridge.docx
@@ -101,7 +101,7 @@
                 <w:rFonts w:ascii="Segoe UI" w:hAnsi="Segoe UI"/>
                 <w:sz w:val="20"/>
               </w:rPr>
-              <w:t>1.9.3</w:t>
+              <w:t>1.9.4</w:t>
             </w:r>
           </w:p>
         </w:tc>
@@ -19056,6 +19056,35 @@
     </w:p>
     <w:p>
       <w:pPr>
+        <w:spacing w:before="120" w:after="200"/>
+        <w:ind w:left="113"/>
+        <w:shd w:val="clear" w:color="auto" w:fill="EBF4FF"/>
+        <w:pBdr>
+          <w:top w:val="single" w:sz="6" w:space="6" w:color="2B6CB0"/>
+          <w:left w:val="single" w:sz="6" w:space="6" w:color="2B6CB0"/>
+          <w:bottom w:val="single" w:sz="6" w:space="6" w:color="2B6CB0"/>
+          <w:right w:val="single" w:sz="6" w:space="6" w:color="2B6CB0"/>
+        </w:pBdr>
+      </w:pPr>
+      <w:r>
+        <w:rPr>
+          <w:rFonts w:ascii="Segoe UI" w:hAnsi="Segoe UI"/>
+          <w:b/>
+          <w:color w:val="2B6CB0"/>
+          <w:sz w:val="20"/>
+        </w:rPr>
+        <w:t xml:space="preserve">Bemærk: </w:t>
+      </w:r>
+      <w:r>
+        <w:rPr>
+          <w:rFonts w:ascii="Segoe UI" w:hAnsi="Segoe UI"/>
+          <w:sz w:val="20"/>
+        </w:rPr>
+        <w:t>Dashboardets knap “Reconnect Bluetooth” og Debug-sidens start/stop/genstart af tjenester går gennem ipr_hotspot_ctl.sh service … (sudoers). Tidligere kaldte de systemctl direkte og fejlede med “Interactive authentication required” — det var linjen “Failed to restart bt_hid_ble.service” i journalen. Bemærk: en genstart af bt_hid_ble.service afbryder den aktive BLE-forbindelse; Windows genforbinder, når enheden annoncerer igen, men kan kræve et tryk på Tilslut eller Bluetooth fra/til på PC'en.</w:t>
+      </w:r>
+    </w:p>
+    <w:p>
+      <w:pPr>
         <w:pStyle w:val="Heading2"/>
       </w:pPr>
       <w:r>
@@ -23827,7 +23856,7 @@
         <w:color w:val="606C80"/>
         <w:sz w:val="16"/>
       </w:rPr>
-      <w:t xml:space="preserve">IPR-DOC-002 · Administratormanual · version 1.9.3   ·   Side </w:t>
+      <w:t xml:space="preserve">IPR-DOC-002 · Administratormanual · version 1.9.4   ·   Side </w:t>
     </w:r>
     <w:r>
       <w:rPr>

</xml_diff>

<commit_message>
fix(bt): deterministic LE-only adapter setup; bonded PC reconnects after restarts
The agent unit ran `hciconfig up` before bluetoothd had applied
ControllerMode = le, so `bredr off` was rejected (tolerated by "-") and the
adapter was dual-mode after every boot but LE-only after a service restart.
A PC bonded in one radio configuration never reconnected in the other,
which is why "Reconnect Bluetooth" appeared to break the link for good.
bt_adapter_prepare.sh waits for bluetoothd to own the adapter and enforces
LE-only, power-cycling it if needed; test_provision C.6b checks it.
Verified on ipr-prod-zero2 after a one-time re-pair. Admin manual 1.9.5.

Co-Authored-By: Claude Opus 5 (1M context) <noreply@anthropic.com>
Claude-Session: https://claude.ai/code/session_01GX15fqsPoufJXa3hdJmFWm
</commit_message>
<xml_diff>
--- a/docs/manuals/Administratormanual_IPR_Pen_Bridge.docx
+++ b/docs/manuals/Administratormanual_IPR_Pen_Bridge.docx
@@ -101,7 +101,7 @@
                 <w:rFonts w:ascii="Segoe UI" w:hAnsi="Segoe UI"/>
                 <w:sz w:val="20"/>
               </w:rPr>
-              <w:t>1.9.4</w:t>
+              <w:t>1.9.5</w:t>
             </w:r>
           </w:p>
         </w:tc>
@@ -19085,6 +19085,35 @@
     </w:p>
     <w:p>
       <w:pPr>
+        <w:spacing w:before="120" w:after="200"/>
+        <w:ind w:left="113"/>
+        <w:shd w:val="clear" w:color="auto" w:fill="FFF7E6"/>
+        <w:pBdr>
+          <w:top w:val="single" w:sz="6" w:space="6" w:color="9A6A00"/>
+          <w:left w:val="single" w:sz="6" w:space="6" w:color="9A6A00"/>
+          <w:bottom w:val="single" w:sz="6" w:space="6" w:color="9A6A00"/>
+          <w:right w:val="single" w:sz="6" w:space="6" w:color="9A6A00"/>
+        </w:pBdr>
+      </w:pPr>
+      <w:r>
+        <w:rPr>
+          <w:rFonts w:ascii="Segoe UI" w:hAnsi="Segoe UI"/>
+          <w:b/>
+          <w:color w:val="9A6A00"/>
+          <w:sz w:val="20"/>
+        </w:rPr>
+        <w:t xml:space="preserve">Vigtigt: </w:t>
+      </w:r>
+      <w:r>
+        <w:rPr>
+          <w:rFonts w:ascii="Segoe UI" w:hAnsi="Segoe UI"/>
+          <w:sz w:val="20"/>
+        </w:rPr>
+        <w:t>Kendt fejl, rettet september 2026: agentens ExecStartPre kørte “hciconfig up” før bluetoothd havde anvendt ControllerMode = le, så adapteren var dual-mode (BR/EDR + LE) efter hver opstart, men LE-only efter en genstart af tjenesten. En PC bundet i den ene konfiguration genforbandt ikke i den anden. bt_adapter_prepare.sh venter nu på bluetoothd og gennemtvinger LE-only (strømcykler adapteren om nødvendigt); test_provision.sh C.6b kontrollerer det. En PC, der blev parret FØR rettelsen, skal fjernes og parres igen én gang.</w:t>
+      </w:r>
+    </w:p>
+    <w:p>
+      <w:pPr>
         <w:pStyle w:val="Heading2"/>
       </w:pPr>
       <w:r>
@@ -23856,7 +23885,7 @@
         <w:color w:val="606C80"/>
         <w:sz w:val="16"/>
       </w:rPr>
-      <w:t xml:space="preserve">IPR-DOC-002 · Administratormanual · version 1.9.4   ·   Side </w:t>
+      <w:t xml:space="preserve">IPR-DOC-002 · Administratormanual · version 1.9.5   ·   Side </w:t>
     </w:r>
     <w:r>
       <w:rPr>

</xml_diff>

<commit_message>
fix(pen): remember delivered scans across restarts and re-plugs; deliver in order
The watcher kept "newest handled file" in memory only: every service restart
re-typed the newest scan still on the pen (seen on the PC), and files older
than the newest were never delivered at all. The mark is now persisted per
folder (pen_state.json in the project root), a folder seen for the first
time is baselined without sending anything, and after that every new file
is delivered once, oldest first. Admin manual 1.9.7.

Co-Authored-By: Claude Opus 5 (1M context) <noreply@anthropic.com>
Claude-Session: https://claude.ai/code/session_01GX15fqsPoufJXa3hdJmFWm
</commit_message>
<xml_diff>
--- a/docs/manuals/Administratormanual_IPR_Pen_Bridge.docx
+++ b/docs/manuals/Administratormanual_IPR_Pen_Bridge.docx
@@ -2442,7 +2442,7 @@
                 <w:rFonts w:ascii="Consolas" w:hAnsi="Consolas"/>
                 <w:sz w:val="18"/>
               </w:rPr>
-              <w:t>/usr/local/sbin/ipr-firewall.sh</w:t>
+              <w:t>&lt;projektrod&gt;/pen_state.json</w:t>
             </w:r>
           </w:p>
         </w:tc>
@@ -2459,7 +2459,7 @@
                 <w:rFonts w:ascii="Segoe UI" w:hAnsi="Segoe UI"/>
                 <w:sz w:val="19"/>
               </w:rPr>
-              <w:t>nftables-politik ud fra tilstand og hotspot (apply/status/off).</w:t>
+              <w:t>Pr. mappe: tidsstempel for den sidst afsendte skanning. Sikrer, at en genstart eller en ind-/udstikning af pennen aldrig skriver en gammel skanning igen. En mappe, der ses første gang, sættes som udgangspunkt uden at sende noget.</w:t>
             </w:r>
           </w:p>
         </w:tc>
@@ -2479,7 +2479,7 @@
                 <w:rFonts w:ascii="Consolas" w:hAnsi="Consolas"/>
                 <w:sz w:val="18"/>
               </w:rPr>
-              <w:t>/usr/local/bin/ipr_mode_ctl.sh</w:t>
+              <w:t>/usr/local/sbin/ipr-firewall.sh</w:t>
             </w:r>
           </w:p>
         </w:tc>
@@ -2497,7 +2497,7 @@
                 <w:rFonts w:ascii="Segoe UI" w:hAnsi="Segoe UI"/>
                 <w:sz w:val="19"/>
               </w:rPr>
-              <w:t>Skifter drift/udvikling; magneten (10 s) bruger den via sudoers.</w:t>
+              <w:t>nftables-politik ud fra tilstand og hotspot (apply/status/off).</w:t>
             </w:r>
           </w:p>
         </w:tc>
@@ -2516,7 +2516,7 @@
                 <w:rFonts w:ascii="Consolas" w:hAnsi="Consolas"/>
                 <w:sz w:val="18"/>
               </w:rPr>
-              <w:t>/var/lib/ipr-keyboard/mode</w:t>
+              <w:t>/usr/local/bin/ipr_mode_ctl.sh</w:t>
             </w:r>
           </w:p>
         </w:tc>
@@ -2533,7 +2533,7 @@
                 <w:rFonts w:ascii="Segoe UI" w:hAnsi="Segoe UI"/>
                 <w:sz w:val="19"/>
               </w:rPr>
-              <w:t>Tilstandsfil: production eller development.</w:t>
+              <w:t>Skifter drift/udvikling; magneten (10 s) bruger den via sudoers.</w:t>
             </w:r>
           </w:p>
         </w:tc>
@@ -2553,7 +2553,7 @@
                 <w:rFonts w:ascii="Consolas" w:hAnsi="Consolas"/>
                 <w:sz w:val="18"/>
               </w:rPr>
-              <w:t>/var/lib/ipr-keyboard/incidents.log</w:t>
+              <w:t>/var/lib/ipr-keyboard/mode</w:t>
             </w:r>
           </w:p>
         </w:tc>
@@ -2571,7 +2571,7 @@
                 <w:rFonts w:ascii="Segoe UI" w:hAnsi="Segoe UI"/>
                 <w:sz w:val="19"/>
               </w:rPr>
-              <w:t>Én linje pr. fejlet kerneenhed (tidspunkt, enhed, resultat). Overlever genstart og journalrotation.</w:t>
+              <w:t>Tilstandsfil: production eller development.</w:t>
             </w:r>
           </w:p>
         </w:tc>
@@ -2590,7 +2590,7 @@
                 <w:rFonts w:ascii="Consolas" w:hAnsi="Consolas"/>
                 <w:sz w:val="18"/>
               </w:rPr>
-              <w:t>/etc/systemd/journald.conf.d/ipr.conf</w:t>
+              <w:t>/var/lib/ipr-keyboard/incidents.log</w:t>
             </w:r>
           </w:p>
         </w:tc>
@@ -2607,7 +2607,7 @@
                 <w:rFonts w:ascii="Segoe UI" w:hAnsi="Segoe UI"/>
                 <w:sz w:val="19"/>
               </w:rPr>
-              <w:t>Persistent journal, højst 64 MB / 1 måned.</w:t>
+              <w:t>Én linje pr. fejlet kerneenhed (tidspunkt, enhed, resultat). Overlever genstart og journalrotation.</w:t>
             </w:r>
           </w:p>
         </w:tc>
@@ -2627,7 +2627,7 @@
                 <w:rFonts w:ascii="Consolas" w:hAnsi="Consolas"/>
                 <w:sz w:val="18"/>
               </w:rPr>
-              <w:t>/etc/udev/rules.d/69-irispen-mtp.rules</w:t>
+              <w:t>/etc/systemd/journald.conf.d/ipr.conf</w:t>
             </w:r>
           </w:p>
         </w:tc>
@@ -2645,7 +2645,7 @@
                 <w:rFonts w:ascii="Segoe UI" w:hAnsi="Segoe UI"/>
                 <w:sz w:val="19"/>
               </w:rPr>
-              <w:t>Rettigheder til skanneren og dev-irispen.device til systemd (automontering).</w:t>
+              <w:t>Persistent journal, højst 64 MB / 1 måned.</w:t>
             </w:r>
           </w:p>
         </w:tc>
@@ -2664,7 +2664,7 @@
                 <w:rFonts w:ascii="Consolas" w:hAnsi="Consolas"/>
                 <w:sz w:val="18"/>
               </w:rPr>
-              <w:t>/etc/NetworkManager/dispatcher.d/90-ipr-firewall</w:t>
+              <w:t>/etc/udev/rules.d/69-irispen-mtp.rules</w:t>
             </w:r>
           </w:p>
         </w:tc>
@@ -2681,7 +2681,7 @@
                 <w:rFonts w:ascii="Segoe UI" w:hAnsi="Segoe UI"/>
                 <w:sz w:val="19"/>
               </w:rPr>
-              <w:t>Genanvender politikken ved enhver forbindelsesændring.</w:t>
+              <w:t>Rettigheder til skanneren og dev-irispen.device til systemd (automontering).</w:t>
             </w:r>
           </w:p>
         </w:tc>
@@ -2701,7 +2701,7 @@
                 <w:rFonts w:ascii="Consolas" w:hAnsi="Consolas"/>
                 <w:sz w:val="18"/>
               </w:rPr>
-              <w:t>/run/ipr_bt_keyboard_fifo</w:t>
+              <w:t>/etc/NetworkManager/dispatcher.d/90-ipr-firewall</w:t>
             </w:r>
           </w:p>
         </w:tc>
@@ -2719,7 +2719,7 @@
                 <w:rFonts w:ascii="Segoe UI" w:hAnsi="Segoe UI"/>
                 <w:sz w:val="19"/>
               </w:rPr>
-              <w:t>Navngiven pipe mellem app og BLE-dæmon.</w:t>
+              <w:t>Genanvender politikken ved enhver forbindelsesændring.</w:t>
             </w:r>
           </w:p>
         </w:tc>
@@ -2738,7 +2738,7 @@
                 <w:rFonts w:ascii="Consolas" w:hAnsi="Consolas"/>
                 <w:sz w:val="18"/>
               </w:rPr>
-              <w:t>/etc/ipr-ssl/</w:t>
+              <w:t>/run/ipr_bt_keyboard_fifo</w:t>
             </w:r>
           </w:p>
         </w:tc>
@@ -2755,7 +2755,7 @@
                 <w:rFonts w:ascii="Segoe UI" w:hAnsi="Segoe UI"/>
                 <w:sz w:val="19"/>
               </w:rPr>
-              <w:t>CA og servercertifikat samt private nøgler.</w:t>
+              <w:t>Navngiven pipe mellem app og BLE-dæmon.</w:t>
             </w:r>
           </w:p>
         </w:tc>
@@ -2775,7 +2775,7 @@
                 <w:rFonts w:ascii="Consolas" w:hAnsi="Consolas"/>
                 <w:sz w:val="18"/>
               </w:rPr>
-              <w:t>/etc/ipr-hotspot.secret</w:t>
+              <w:t>/etc/ipr-ssl/</w:t>
             </w:r>
           </w:p>
         </w:tc>
@@ -2793,7 +2793,7 @@
                 <w:rFonts w:ascii="Segoe UI" w:hAnsi="Segoe UI"/>
                 <w:sz w:val="19"/>
               </w:rPr>
-              <w:t>SSID og adgangskode til hotspot (tilstand 0600).</w:t>
+              <w:t>CA og servercertifikat samt private nøgler.</w:t>
             </w:r>
           </w:p>
         </w:tc>
@@ -2812,7 +2812,7 @@
                 <w:rFonts w:ascii="Consolas" w:hAnsi="Consolas"/>
                 <w:sz w:val="18"/>
               </w:rPr>
-              <w:t>/opt/ipr_common.env</w:t>
+              <w:t>/etc/ipr-hotspot.secret</w:t>
             </w:r>
           </w:p>
         </w:tc>
@@ -2829,7 +2829,7 @@
                 <w:rFonts w:ascii="Segoe UI" w:hAnsi="Segoe UI"/>
                 <w:sz w:val="19"/>
               </w:rPr>
-              <w:t>Miljøvariable for provisionering og skripts.</w:t>
+              <w:t>SSID og adgangskode til hotspot (tilstand 0600).</w:t>
             </w:r>
           </w:p>
         </w:tc>
@@ -2849,7 +2849,7 @@
                 <w:rFonts w:ascii="Consolas" w:hAnsi="Consolas"/>
                 <w:sz w:val="18"/>
               </w:rPr>
-              <w:t>/opt/ipr_state/</w:t>
+              <w:t>/opt/ipr_common.env</w:t>
             </w:r>
           </w:p>
         </w:tc>
@@ -2867,7 +2867,7 @@
                 <w:rFonts w:ascii="Segoe UI" w:hAnsi="Segoe UI"/>
                 <w:sz w:val="19"/>
               </w:rPr>
-              <w:t>Tilstands- og verifikationsoutput fra provisioneringen.</w:t>
+              <w:t>Miljøvariable for provisionering og skripts.</w:t>
             </w:r>
           </w:p>
         </w:tc>
@@ -2886,6 +2886,43 @@
                 <w:rFonts w:ascii="Consolas" w:hAnsi="Consolas"/>
                 <w:sz w:val="18"/>
               </w:rPr>
+              <w:t>/opt/ipr_state/</w:t>
+            </w:r>
+          </w:p>
+        </w:tc>
+        <w:tc>
+          <w:tcPr>
+            <w:tcW w:type="dxa" w:w="5102"/>
+          </w:tcPr>
+          <w:p>
+            <w:pPr>
+              <w:spacing w:after="40"/>
+            </w:pPr>
+            <w:r>
+              <w:rPr>
+                <w:rFonts w:ascii="Segoe UI" w:hAnsi="Segoe UI"/>
+                <w:sz w:val="19"/>
+              </w:rPr>
+              <w:t>Tilstands- og verifikationsoutput fra provisioneringen.</w:t>
+            </w:r>
+          </w:p>
+        </w:tc>
+      </w:tr>
+      <w:tr>
+        <w:tc>
+          <w:tcPr>
+            <w:tcW w:type="dxa" w:w="3742"/>
+            <w:shd w:val="clear" w:color="auto" w:fill="F7FAFC"/>
+          </w:tcPr>
+          <w:p>
+            <w:pPr>
+              <w:spacing w:after="40"/>
+            </w:pPr>
+            <w:r>
+              <w:rPr>
+                <w:rFonts w:ascii="Consolas" w:hAnsi="Consolas"/>
+                <w:sz w:val="18"/>
+              </w:rPr>
               <w:t>/var/lib/ipr-keyboard/boot-count</w:t>
             </w:r>
           </w:p>
@@ -2893,6 +2930,7 @@
         <w:tc>
           <w:tcPr>
             <w:tcW w:type="dxa" w:w="5102"/>
+            <w:shd w:val="clear" w:color="auto" w:fill="F7FAFC"/>
           </w:tcPr>
           <w:p>
             <w:pPr>

</xml_diff>

<commit_message>
fix(led): shutdown step is white, not cyan; boot and shutdown share a colour
On the small LED the cyan 6 s blink could not be told apart from the blue
3 s blink, so users released too early and started the hotspot instead of
shutting down. White now marks both power transitions (white = the device is
powering up or down). Manuals user 1.7 / admin 1.9.8, figures, docs.

Co-Authored-By: Claude Opus 5 (1M context) <noreply@anthropic.com>
Claude-Session: https://claude.ai/code/session_01GX15fqsPoufJXa3hdJmFWm
</commit_message>
<xml_diff>
--- a/docs/manuals/Administratormanual_IPR_Pen_Bridge.docx
+++ b/docs/manuals/Administratormanual_IPR_Pen_Bridge.docx
@@ -12792,7 +12792,7 @@
           <w:i w:val="0"/>
           <w:sz w:val="21"/>
         </w:rPr>
-        <w:t>Enheden forsynes typisk fra PC'ens USB-port, og et SD-kort, der mister strømmen under en skrivning, kan blive ødelagt. Magneten giver en kontrolleret nedlukning: hold i 6 sekunder (lampen blinker turkis) og slip. gpio_monitor kalder ipr_hotspot_ctl.sh poweroff (systemctl poweroff) og viser konstant turkis; når systemd stopper ipr_keyboard.service, efterlades benene bevidst på turkis, og ipr-led-halt.service — startet tidligt ved opstart uden at gøre noget, så dens ExecStop kører sent i nedlukningen — slukker lampen (pinctrl) lige før kernen standser. Mørk lampe = strømmen må tages fra. En standset Pi Zero kan ikke startes med magneten; afbryd og tilslut strømmen.</w:t>
+        <w:t>Enheden forsynes typisk fra PC'ens USB-port, og et SD-kort, der mister strømmen under en skrivning, kan blive ødelagt. Magneten giver en kontrolleret nedlukning: hold i 6 sekunder (lampen blinker hvid) og slip. gpio_monitor kalder ipr_hotspot_ctl.sh poweroff (systemctl poweroff) og viser konstant hvid; når systemd stopper ipr_keyboard.service, efterlades benene bevidst på hvid, og ipr-led-halt.service — startet tidligt ved opstart uden at gøre noget, så dens ExecStop kører sent i nedlukningen — slukker lampen (pinctrl) lige før kernen standser. Mørk lampe = strømmen må tages fra. En standset Pi Zero kan ikke startes med magneten; afbryd og tilslut strømmen.</w:t>
       </w:r>
     </w:p>
     <w:tbl>
@@ -13009,7 +13009,7 @@
                 <w:rFonts w:ascii="Segoe UI" w:hAnsi="Segoe UI"/>
                 <w:sz w:val="19"/>
               </w:rPr>
-              <w:t>turkis blink</w:t>
+              <w:t>hvid blink</w:t>
             </w:r>
           </w:p>
         </w:tc>
@@ -13026,7 +13026,7 @@
                 <w:rFonts w:ascii="Segoe UI" w:hAnsi="Segoe UI"/>
                 <w:sz w:val="19"/>
               </w:rPr>
-              <w:t>kontrolleret nedlukning; turkis → slukket = sikkert at afbryde</w:t>
+              <w:t>kontrolleret nedlukning; hvid konstant → slukket = sikkert at afbryde (hvid = boksen starter eller slukker; turkis blev opgivet, da det ikke kunne skelnes fra det blå blink ved 3 s)</w:t>
             </w:r>
           </w:p>
         </w:tc>
@@ -20430,7 +20430,7 @@
                 <w:rFonts w:ascii="Segoe UI" w:hAnsi="Segoe UI"/>
                 <w:sz w:val="19"/>
               </w:rPr>
-              <w:t>Lampen lyser konstant turkis og går ikke ud.</w:t>
+              <w:t>Lampen lyser konstant hvid og går ikke ud.</w:t>
             </w:r>
           </w:p>
         </w:tc>
@@ -21219,7 +21219,7 @@
           <w:rFonts w:ascii="Segoe UI" w:hAnsi="Segoe UI"/>
           <w:sz w:val="21"/>
         </w:rPr>
-        <w:t>Magneten i 6 sekunder lukker enheden ned: turkis, derefter slukket lampe.</w:t>
+        <w:t>Magneten i 6 sekunder lukker enheden ned: hvid, derefter slukket lampe.</w:t>
       </w:r>
     </w:p>
     <w:p>

</xml_diff>

<commit_message>
fix(net): never modify a netplan-generated profile; clone to an NM-owned one
`nmcli con modify` on the profile netplan generates at boot made
NetworkManager's netplan backend rewrite the YAML and lose it, password
included - the device booted with no home network. ipr_net_apply.sh now
clones such a profile to ipr-home (secrets copied, higher autoconnect
priority) and applies IPv4 settings there; the generated profile is left
alone. Admin manual 1.9.9 documents the symptom and the recovery.

Co-Authored-By: Claude Opus 5 (1M context) <noreply@anthropic.com>
Claude-Session: https://claude.ai/code/session_01GX15fqsPoufJXa3hdJmFWm
</commit_message>
<xml_diff>
--- a/docs/manuals/Administratormanual_IPR_Pen_Bridge.docx
+++ b/docs/manuals/Administratormanual_IPR_Pen_Bridge.docx
@@ -19897,7 +19897,7 @@
                 <w:rFonts w:ascii="Segoe UI" w:hAnsi="Segoe UI"/>
                 <w:sz w:val="19"/>
               </w:rPr>
-              <w:t>Kan ikke nå &lt;værtsnavn&gt;.local, men IP-adressen virker.</w:t>
+              <w:t>Lampen blinker langsomt rødt efter genstart; nmcli con show viser ingen netplan-wlan0-profil.</w:t>
             </w:r>
           </w:p>
         </w:tc>
@@ -19915,7 +19915,7 @@
                 <w:rFonts w:ascii="Segoe UI" w:hAnsi="Segoe UI"/>
                 <w:sz w:val="19"/>
               </w:rPr>
-              <w:t>Navnet slås op til en IPv6-adresse (Windows foretrækker AAAA), og dashboardet lytter kun på IPv4 — eller enheden er i drift (mDNS lukket).</w:t>
+              <w:t>Wi-Fi-profilen er væk (se noten under 10.5 om netplan).</w:t>
             </w:r>
           </w:p>
         </w:tc>
@@ -19933,7 +19933,7 @@
                 <w:rFonts w:ascii="Segoe UI" w:hAnsi="Segoe UI"/>
                 <w:sz w:val="19"/>
               </w:rPr>
-              <w:t>install_firewall.sh sætter avahi til kun IPv4 (use-ipv6=no); kør den igen på ældre enheder. I drift virker navnet ikke — brug hotspottet. Ellers brug IP-adressen.</w:t>
+              <w:t>Tænd hotspottet (magnet 3 s), setup-portalen → Wi-Fi → vælg nettet og indtast adgangskoden; sluk hotspottet igen (magnet 3 s).</w:t>
             </w:r>
           </w:p>
         </w:tc>
@@ -19952,6 +19952,60 @@
                 <w:rFonts w:ascii="Segoe UI" w:hAnsi="Segoe UI"/>
                 <w:sz w:val="19"/>
               </w:rPr>
+              <w:t>Kan ikke nå &lt;værtsnavn&gt;.local, men IP-adressen virker.</w:t>
+            </w:r>
+          </w:p>
+        </w:tc>
+        <w:tc>
+          <w:tcPr>
+            <w:tcW w:type="dxa" w:w="2494"/>
+          </w:tcPr>
+          <w:p>
+            <w:pPr>
+              <w:spacing w:after="40"/>
+            </w:pPr>
+            <w:r>
+              <w:rPr>
+                <w:rFonts w:ascii="Segoe UI" w:hAnsi="Segoe UI"/>
+                <w:sz w:val="19"/>
+              </w:rPr>
+              <w:t>Navnet slås op til en IPv6-adresse (Windows foretrækker AAAA), og dashboardet lytter kun på IPv4 — eller enheden er i drift (mDNS lukket).</w:t>
+            </w:r>
+          </w:p>
+        </w:tc>
+        <w:tc>
+          <w:tcPr>
+            <w:tcW w:type="dxa" w:w="3969"/>
+          </w:tcPr>
+          <w:p>
+            <w:pPr>
+              <w:spacing w:after="40"/>
+            </w:pPr>
+            <w:r>
+              <w:rPr>
+                <w:rFonts w:ascii="Segoe UI" w:hAnsi="Segoe UI"/>
+                <w:sz w:val="19"/>
+              </w:rPr>
+              <w:t>install_firewall.sh sætter avahi til kun IPv4 (use-ipv6=no); kør den igen på ældre enheder. I drift virker navnet ikke — brug hotspottet. Ellers brug IP-adressen.</w:t>
+            </w:r>
+          </w:p>
+        </w:tc>
+      </w:tr>
+      <w:tr>
+        <w:tc>
+          <w:tcPr>
+            <w:tcW w:type="dxa" w:w="2381"/>
+            <w:shd w:val="clear" w:color="auto" w:fill="F7FAFC"/>
+          </w:tcPr>
+          <w:p>
+            <w:pPr>
+              <w:spacing w:after="40"/>
+            </w:pPr>
+            <w:r>
+              <w:rPr>
+                <w:rFonts w:ascii="Segoe UI" w:hAnsi="Segoe UI"/>
+                <w:sz w:val="19"/>
+              </w:rPr>
               <w:t>Enheden mistede netværket efter et statisk IP-skift.</w:t>
             </w:r>
           </w:p>
@@ -19959,6 +20013,7 @@
         <w:tc>
           <w:tcPr>
             <w:tcW w:type="dxa" w:w="2494"/>
+            <w:shd w:val="clear" w:color="auto" w:fill="F7FAFC"/>
           </w:tcPr>
           <w:p>
             <w:pPr>
@@ -19976,6 +20031,7 @@
         <w:tc>
           <w:tcPr>
             <w:tcW w:type="dxa" w:w="3969"/>
+            <w:shd w:val="clear" w:color="auto" w:fill="F7FAFC"/>
           </w:tcPr>
           <w:p>
             <w:pPr>
@@ -20592,6 +20648,35 @@
           <w:sz w:val="18"/>
         </w:rPr>
         <w:t>Tabel 34. Fejlmønstre for statuslampen og reed-kontakten. Fase K i test_provision.sh kontrollerer, at alle dele er installeret.</w:t>
+      </w:r>
+    </w:p>
+    <w:p>
+      <w:pPr>
+        <w:spacing w:before="120" w:after="200"/>
+        <w:ind w:left="113"/>
+        <w:shd w:val="clear" w:color="auto" w:fill="FFF7E6"/>
+        <w:pBdr>
+          <w:top w:val="single" w:sz="6" w:space="6" w:color="9A6A00"/>
+          <w:left w:val="single" w:sz="6" w:space="6" w:color="9A6A00"/>
+          <w:bottom w:val="single" w:sz="6" w:space="6" w:color="9A6A00"/>
+          <w:right w:val="single" w:sz="6" w:space="6" w:color="9A6A00"/>
+        </w:pBdr>
+      </w:pPr>
+      <w:r>
+        <w:rPr>
+          <w:rFonts w:ascii="Segoe UI" w:hAnsi="Segoe UI"/>
+          <w:b/>
+          <w:color w:val="9A6A00"/>
+          <w:sz w:val="20"/>
+        </w:rPr>
+        <w:t xml:space="preserve">Vigtigt: </w:t>
+      </w:r>
+      <w:r>
+        <w:rPr>
+          <w:rFonts w:ascii="Segoe UI" w:hAnsi="Segoe UI"/>
+          <w:sz w:val="20"/>
+        </w:rPr>
+        <w:t>Kendt fejl, rettet 14. september 2026: dashboardets netværksindstillinger ændrede den profil, som netplan genererer ved opstart (netplan-wlan0-&lt;SSID&gt;). NetworkManager bruger her sin netplan-backend, og omskrivningen mistede Wi-Fi-YAML'en inklusive adgangskoden — enheden kom op uden hjemmenet efter næste genstart. ipr_net_apply.sh rører nu aldrig en genereret profil, men kloner den til en NM-ejet profil (ipr-home) med højere autoconnect-prioritet. Er hjemmenettet forsvundet: sæt det op igen via setup-portalens Wi-Fi-side (via hotspottet) eller nmcli con add type wifi …</w:t>
       </w:r>
     </w:p>
     <w:p>

</xml_diff>

<commit_message>
fix(setup): confirm an unseen typed SSID; Pen card reports a disabled USB port
A one-letter typo in an nmcli SSID cost a day of "no home network"
(ssid-not-found). The Wi-Fi page now asks for confirmation when a typed
SSID was not in the last scan, and the saved message repeats the exact name.
The Pen card shows "USB port off" when the kernel has disabled the port
after enumeration errors (only a reboot recovers it; a dwc_otg driver
rebind crashes the kernel and is documented as forbidden). Admin manual 1.10.0.

Co-Authored-By: Claude Opus 5 (1M context) <noreply@anthropic.com>
Claude-Session: https://claude.ai/code/session_01GX15fqsPoufJXa3hdJmFWm
</commit_message>
<xml_diff>
--- a/docs/manuals/Administratormanual_IPR_Pen_Bridge.docx
+++ b/docs/manuals/Administratormanual_IPR_Pen_Bridge.docx
@@ -13867,6 +13867,17 @@
           <w:i w:val="0"/>
           <w:sz w:val="21"/>
         </w:rPr>
+        <w:t>Mens hotspottet er tændt, kan enheden ikke søge efter netværk (radioen er optaget som accesspoint). Wi-Fi-siden har derfor et felt til at skrive SSID'et; et navn, der ikke sås i seneste søgning, kræver en bekræftelse — ét manglende bogstav i SSID'et gav “ssid-not-found” og en dag uden hjemmenet.</w:t>
+      </w:r>
+    </w:p>
+    <w:p>
+      <w:r>
+        <w:rPr>
+          <w:rFonts w:ascii="Segoe UI" w:hAnsi="Segoe UI"/>
+          <w:b w:val="0"/>
+          <w:i w:val="0"/>
+          <w:sz w:val="21"/>
+        </w:rPr>
         <w:t>Tilslut derefter til SSID'et ipr-setup-xxxx og åbn https://10.42.0.1/setup/. Log ind som brugeren ipr med adgangskoden fra PASS-linjen i /etc/ipr-hotspot.secret. Selve dashboardet nås på hotspottet via https://10.42.0.1/login (en ikke-indlogget klient på 10.42.0.x sendes bevidst til setup-login, hvis den åbner roden). Setup-forsiden viser adressen.</w:t>
       </w:r>
     </w:p>
@@ -19952,7 +19963,7 @@
                 <w:rFonts w:ascii="Segoe UI" w:hAnsi="Segoe UI"/>
                 <w:sz w:val="19"/>
               </w:rPr>
-              <w:t>Kan ikke nå &lt;værtsnavn&gt;.local, men IP-adressen virker.</w:t>
+              <w:t>Skanneren ses ikke, og dashboardets pen-kort viser “USB port off”.</w:t>
             </w:r>
           </w:p>
         </w:tc>
@@ -19969,7 +19980,7 @@
                 <w:rFonts w:ascii="Segoe UI" w:hAnsi="Segoe UI"/>
                 <w:sz w:val="19"/>
               </w:rPr>
-              <w:t>Navnet slås op til en IPv6-adresse (Windows foretrækker AAAA), og dashboardet lytter kun på IPv4 — eller enheden er i drift (mDNS lukket).</w:t>
+              <w:t>Kernen har slukket Pi'ens USB-port efter gentagne fejl ved tilslutning (journalctl -k: “device descriptor read/64, error -71” og “attempt power cycle”). En slukket port ser intet, uanset kabel.</w:t>
             </w:r>
           </w:p>
         </w:tc>
@@ -19986,7 +19997,7 @@
                 <w:rFonts w:ascii="Segoe UI" w:hAnsi="Segoe UI"/>
                 <w:sz w:val="19"/>
               </w:rPr>
-              <w:t>install_firewall.sh sætter avahi til kun IPv4 (use-ipv6=no); kør den igen på ældre enheder. I drift virker navnet ikke — brug hotspottet. Ellers brug IP-adressen.</w:t>
+              <w:t>Genstart enheden (magnet 6 s, strøm fra/til). Kommer -71 igen efter genstart, er det pennen, kablet eller OTG-adapteren — test pennen på PC'en. Forsøg ALDRIG at gen-binde dwc_otg-driveren; det crasher kernen.</w:t>
             </w:r>
           </w:p>
         </w:tc>
@@ -20006,7 +20017,7 @@
                 <w:rFonts w:ascii="Segoe UI" w:hAnsi="Segoe UI"/>
                 <w:sz w:val="19"/>
               </w:rPr>
-              <w:t>Enheden mistede netværket efter et statisk IP-skift.</w:t>
+              <w:t>Kan ikke nå &lt;værtsnavn&gt;.local, men IP-adressen virker.</w:t>
             </w:r>
           </w:p>
         </w:tc>
@@ -20024,7 +20035,7 @@
                 <w:rFonts w:ascii="Segoe UI" w:hAnsi="Segoe UI"/>
                 <w:sz w:val="19"/>
               </w:rPr>
-              <w:t>Forkert adresse, netmaske eller gateway.</w:t>
+              <w:t>Navnet slås op til en IPv6-adresse (Windows foretrækker AAAA), og dashboardet lytter kun på IPv4 — eller enheden er i drift (mDNS lukket).</w:t>
             </w:r>
           </w:p>
         </w:tc>
@@ -20032,6 +20043,59 @@
           <w:tcPr>
             <w:tcW w:type="dxa" w:w="3969"/>
             <w:shd w:val="clear" w:color="auto" w:fill="F7FAFC"/>
+          </w:tcPr>
+          <w:p>
+            <w:pPr>
+              <w:spacing w:after="40"/>
+            </w:pPr>
+            <w:r>
+              <w:rPr>
+                <w:rFonts w:ascii="Segoe UI" w:hAnsi="Segoe UI"/>
+                <w:sz w:val="19"/>
+              </w:rPr>
+              <w:t>install_firewall.sh sætter avahi til kun IPv4 (use-ipv6=no); kør den igen på ældre enheder. I drift virker navnet ikke — brug hotspottet. Ellers brug IP-adressen.</w:t>
+            </w:r>
+          </w:p>
+        </w:tc>
+      </w:tr>
+      <w:tr>
+        <w:tc>
+          <w:tcPr>
+            <w:tcW w:type="dxa" w:w="2381"/>
+          </w:tcPr>
+          <w:p>
+            <w:pPr>
+              <w:spacing w:after="40"/>
+            </w:pPr>
+            <w:r>
+              <w:rPr>
+                <w:rFonts w:ascii="Segoe UI" w:hAnsi="Segoe UI"/>
+                <w:sz w:val="19"/>
+              </w:rPr>
+              <w:t>Enheden mistede netværket efter et statisk IP-skift.</w:t>
+            </w:r>
+          </w:p>
+        </w:tc>
+        <w:tc>
+          <w:tcPr>
+            <w:tcW w:type="dxa" w:w="2494"/>
+          </w:tcPr>
+          <w:p>
+            <w:pPr>
+              <w:spacing w:after="40"/>
+            </w:pPr>
+            <w:r>
+              <w:rPr>
+                <w:rFonts w:ascii="Segoe UI" w:hAnsi="Segoe UI"/>
+                <w:sz w:val="19"/>
+              </w:rPr>
+              <w:t>Forkert adresse, netmaske eller gateway.</w:t>
+            </w:r>
+          </w:p>
+        </w:tc>
+        <w:tc>
+          <w:tcPr>
+            <w:tcW w:type="dxa" w:w="3969"/>
           </w:tcPr>
           <w:p>
             <w:pPr>

</xml_diff>

<commit_message>
feat(led): held phases are steady colours with a dark gap at each step
Fast blinks in neighbouring hues (blue/cyan, then blue/white) could not be
told apart on the small LED, so users released in the wrong phase. While the
magnet is held the LED now shows one steady colour per phase - dark, blue,
white, purple, red, dark - and every change begins with a 0.3 s dark gap so
the step registers as a click. Blinking is reserved for actions in progress
after release. Manuals user 1.8 / admin 1.10.1, figures, docs.

Co-Authored-By: Claude Opus 5 (1M context) <noreply@anthropic.com>
Claude-Session: https://claude.ai/code/session_01GX15fqsPoufJXa3hdJmFWm
</commit_message>
<xml_diff>
--- a/docs/manuals/Administratormanual_IPR_Pen_Bridge.docx
+++ b/docs/manuals/Administratormanual_IPR_Pen_Bridge.docx
@@ -12792,7 +12792,7 @@
           <w:i w:val="0"/>
           <w:sz w:val="21"/>
         </w:rPr>
-        <w:t>Enheden forsynes typisk fra PC'ens USB-port, og et SD-kort, der mister strømmen under en skrivning, kan blive ødelagt. Magneten giver en kontrolleret nedlukning: hold i 6 sekunder (lampen blinker hvid) og slip. gpio_monitor kalder ipr_hotspot_ctl.sh poweroff (systemctl poweroff) og viser konstant hvid; når systemd stopper ipr_keyboard.service, efterlades benene bevidst på hvid, og ipr-led-halt.service — startet tidligt ved opstart uden at gøre noget, så dens ExecStop kører sent i nedlukningen — slukker lampen (pinctrl) lige før kernen standser. Mørk lampe = strømmen må tages fra. En standset Pi Zero kan ikke startes med magneten; afbryd og tilslut strømmen.</w:t>
+        <w:t>Enheden forsynes typisk fra PC'ens USB-port, og et SD-kort, der mister strømmen under en skrivning, kan blive ødelagt. Magneten giver en kontrolleret nedlukning: hold i 6 sekunder (lampen lyser hvidt) og slip. gpio_monitor kalder ipr_hotspot_ctl.sh poweroff (systemctl poweroff) og viser konstant hvid; når systemd stopper ipr_keyboard.service, efterlades benene bevidst på hvid, og ipr-led-halt.service — startet tidligt ved opstart uden at gøre noget, så dens ExecStop kører sent i nedlukningen — slukker lampen (pinctrl) lige før kernen standser. Mørk lampe = strømmen må tages fra. En standset Pi Zero kan ikke startes med magneten; afbryd og tilslut strømmen.</w:t>
       </w:r>
     </w:p>
     <w:tbl>
@@ -12937,7 +12937,7 @@
                 <w:rFonts w:ascii="Segoe UI" w:hAnsi="Segoe UI"/>
                 <w:sz w:val="19"/>
               </w:rPr>
-              <w:t>3 s</w:t>
+              <w:t>3–6 s</w:t>
             </w:r>
           </w:p>
         </w:tc>
@@ -12955,7 +12955,7 @@
                 <w:rFonts w:ascii="Segoe UI" w:hAnsi="Segoe UI"/>
                 <w:sz w:val="19"/>
               </w:rPr>
-              <w:t>blå blink</w:t>
+              <w:t>blå, konstant</w:t>
             </w:r>
           </w:p>
         </w:tc>
@@ -12992,7 +12992,7 @@
                 <w:rFonts w:ascii="Segoe UI" w:hAnsi="Segoe UI"/>
                 <w:sz w:val="19"/>
               </w:rPr>
-              <w:t>6 s</w:t>
+              <w:t>6–10 s</w:t>
             </w:r>
           </w:p>
         </w:tc>
@@ -13009,7 +13009,7 @@
                 <w:rFonts w:ascii="Segoe UI" w:hAnsi="Segoe UI"/>
                 <w:sz w:val="19"/>
               </w:rPr>
-              <w:t>hvid blink</w:t>
+              <w:t>hvid, konstant</w:t>
             </w:r>
           </w:p>
         </w:tc>
@@ -13046,7 +13046,7 @@
                 <w:rFonts w:ascii="Segoe UI" w:hAnsi="Segoe UI"/>
                 <w:sz w:val="19"/>
               </w:rPr>
-              <w:t>10 s</w:t>
+              <w:t>10–15 s</w:t>
             </w:r>
           </w:p>
         </w:tc>
@@ -13064,7 +13064,7 @@
                 <w:rFonts w:ascii="Segoe UI" w:hAnsi="Segoe UI"/>
                 <w:sz w:val="19"/>
               </w:rPr>
-              <w:t>lilla blink</w:t>
+              <w:t>lilla, konstant</w:t>
             </w:r>
           </w:p>
         </w:tc>
@@ -13101,7 +13101,7 @@
                 <w:rFonts w:ascii="Segoe UI" w:hAnsi="Segoe UI"/>
                 <w:sz w:val="19"/>
               </w:rPr>
-              <w:t>15 s</w:t>
+              <w:t>15–20 s</w:t>
             </w:r>
           </w:p>
         </w:tc>
@@ -13118,7 +13118,7 @@
                 <w:rFonts w:ascii="Segoe UI" w:hAnsi="Segoe UI"/>
                 <w:sz w:val="19"/>
               </w:rPr>
-              <w:t>rød blink</w:t>
+              <w:t>rød, konstant</w:t>
             </w:r>
           </w:p>
         </w:tc>
@@ -13209,7 +13209,7 @@
           <w:color w:val="606C80"/>
           <w:sz w:val="18"/>
         </w:rPr>
-        <w:t>Tabel 21. Hele magnet-stigen. Lampen slukker, så snart magneten registreres, og skifter ved hver tærskel — blinkene ses derfor altid mod en mørk lampe, også når den lyste konstant blåt (hotspot) inden. Handlingen udføres først ved slip.</w:t>
+        <w:t>Tabel 21. Hele magnet-stigen. Lampen slukker, så snart magneten registreres, og viser derefter én FAST farve pr. trin; hvert skift indledes med et mørkt blink på 0,3 s, så trinnet kan tælles. Blink er forbeholdt handlinger i gang efter slip (hurtige blink i beslægtede farver kunne ikke skelnes). Handlingen udføres først ved slip.</w:t>
       </w:r>
     </w:p>
     <w:p>
@@ -14447,7 +14447,7 @@
           <w:i w:val="0"/>
           <w:sz w:val="21"/>
         </w:rPr>
-        <w:t>Tilstanden skiftes med magneten (hold i 10 sekunder — lampen blinker lilla — og slip; lampen lyser lilla i 3 sekunder som bekræftelse) eller fra kommandolinjen:</w:t>
+        <w:t>Tilstanden skiftes med magneten (hold i 10 sekunder — lampen lyser lilla — og slip; lampen lyser lilla i 3 sekunder som bekræftelse) eller fra kommandolinjen:</w:t>
       </w:r>
     </w:p>
     <w:p>
@@ -20531,7 +20531,7 @@
                 <w:rFonts w:ascii="Segoe UI" w:hAnsi="Segoe UI"/>
                 <w:sz w:val="19"/>
               </w:rPr>
-              <w:t>Hold magneten i 10 sekunder (lilla blink) og slip: udviklingstilstand, lampen blinker lilla hvert 4. sekund. Eller brug hotspottet (magnet 3 s).</w:t>
+              <w:t>Hold magneten i 10 sekunder (lampen lyser lilla) og slip: udviklingstilstand, lampen blinker lilla hvert 4. sekund. Eller brug hotspottet (magnet 3 s).</w:t>
             </w:r>
           </w:p>
         </w:tc>

</xml_diff>